<commit_message>
Improve final report with figures and analysis
</commit_message>
<xml_diff>
--- a/submission/YourName_RegNum_FGAI_Assignment2.docx
+++ b/submission/YourName_RegNum_FGAI_Assignment2.docx
@@ -5,6 +5,7 @@
     <w:p>
       <w:pPr>
         <w:pStyle w:val="Title"/>
+        <w:spacing w:after="120"/>
         <w:jc w:val="center"/>
       </w:pPr>
       <w:r>
@@ -13,43 +14,48 @@
     </w:p>
     <w:p>
       <w:pPr>
+        <w:pStyle w:val="Subtitle"/>
+        <w:spacing w:after="280"/>
         <w:jc w:val="center"/>
       </w:pPr>
       <w:r>
-        <w:rPr>
-          <w:b/>
-        </w:rPr>
         <w:t>Foundations of Generative AI ICT4403 Assignment 2</w:t>
       </w:r>
     </w:p>
-    <w:p/>
     <w:tbl>
       <w:tblPr>
-        <w:tblStyle w:val="TableGrid"/>
         <w:tblW w:type="auto" w:w="0"/>
         <w:jc w:val="center"/>
+        <w:tblLayout w:type="fixed"/>
         <w:tblLook w:firstColumn="1" w:firstRow="1" w:lastColumn="0" w:lastRow="0" w:noHBand="0" w:noVBand="1" w:val="04A0"/>
       </w:tblPr>
       <w:tblGrid>
-        <w:gridCol w:w="4968"/>
-        <w:gridCol w:w="4968"/>
+        <w:gridCol w:w="4997"/>
+        <w:gridCol w:w="4997"/>
       </w:tblGrid>
       <w:tr>
         <w:tc>
           <w:tcPr>
-            <w:tcW w:type="dxa" w:w="4968"/>
+            <w:tcW w:type="dxa" w:w="2376"/>
             <w:vAlign w:val="center"/>
+            <w:tcMar>
+              <w:top w:w="90" w:type="dxa"/>
+              <w:start w:w="110" w:type="dxa"/>
+              <w:bottom w:w="90" w:type="dxa"/>
+              <w:end w:w="110" w:type="dxa"/>
+            </w:tcMar>
             <w:tcBorders>
               <w:top w:val="single" w:sz="4" w:color="D9D9D9"/>
               <w:left w:val="single" w:sz="4" w:color="D9D9D9"/>
               <w:bottom w:val="single" w:sz="4" w:color="D9D9D9"/>
               <w:right w:val="single" w:sz="4" w:color="D9D9D9"/>
             </w:tcBorders>
-            <w:shd w:fill="D9EAF7"/>
+            <w:shd w:fill="EAF2F8"/>
           </w:tcPr>
           <w:p>
             <w:pPr>
-              <w:jc w:val="center"/>
+              <w:spacing w:after="0" w:line="252" w:lineRule="auto"/>
+              <w:jc w:val="left"/>
             </w:pPr>
             <w:r/>
             <w:r>
@@ -64,8 +70,14 @@
         </w:tc>
         <w:tc>
           <w:tcPr>
-            <w:tcW w:type="dxa" w:w="4968"/>
+            <w:tcW w:type="dxa" w:w="7272"/>
             <w:vAlign w:val="center"/>
+            <w:tcMar>
+              <w:top w:w="90" w:type="dxa"/>
+              <w:start w:w="110" w:type="dxa"/>
+              <w:bottom w:w="90" w:type="dxa"/>
+              <w:end w:w="110" w:type="dxa"/>
+            </w:tcMar>
             <w:tcBorders>
               <w:top w:val="single" w:sz="4" w:color="D9D9D9"/>
               <w:left w:val="single" w:sz="4" w:color="D9D9D9"/>
@@ -75,7 +87,8 @@
           </w:tcPr>
           <w:p>
             <w:pPr>
-              <w:jc w:val="center"/>
+              <w:spacing w:after="0" w:line="252" w:lineRule="auto"/>
+              <w:jc w:val="left"/>
             </w:pPr>
             <w:r/>
             <w:r>
@@ -92,19 +105,26 @@
       <w:tr>
         <w:tc>
           <w:tcPr>
-            <w:tcW w:type="dxa" w:w="4968"/>
+            <w:tcW w:type="dxa" w:w="2376"/>
             <w:vAlign w:val="center"/>
+            <w:tcMar>
+              <w:top w:w="90" w:type="dxa"/>
+              <w:start w:w="110" w:type="dxa"/>
+              <w:bottom w:w="90" w:type="dxa"/>
+              <w:end w:w="110" w:type="dxa"/>
+            </w:tcMar>
             <w:tcBorders>
               <w:top w:val="single" w:sz="4" w:color="D9D9D9"/>
               <w:left w:val="single" w:sz="4" w:color="D9D9D9"/>
               <w:bottom w:val="single" w:sz="4" w:color="D9D9D9"/>
               <w:right w:val="single" w:sz="4" w:color="D9D9D9"/>
             </w:tcBorders>
-            <w:shd w:fill="D9EAF7"/>
+            <w:shd w:fill="EAF2F8"/>
           </w:tcPr>
           <w:p>
             <w:pPr>
-              <w:jc w:val="center"/>
+              <w:spacing w:after="0" w:line="252" w:lineRule="auto"/>
+              <w:jc w:val="left"/>
             </w:pPr>
             <w:r/>
             <w:r>
@@ -119,8 +139,14 @@
         </w:tc>
         <w:tc>
           <w:tcPr>
-            <w:tcW w:type="dxa" w:w="4968"/>
+            <w:tcW w:type="dxa" w:w="7272"/>
             <w:vAlign w:val="center"/>
+            <w:tcMar>
+              <w:top w:w="90" w:type="dxa"/>
+              <w:start w:w="110" w:type="dxa"/>
+              <w:bottom w:w="90" w:type="dxa"/>
+              <w:end w:w="110" w:type="dxa"/>
+            </w:tcMar>
             <w:tcBorders>
               <w:top w:val="single" w:sz="4" w:color="D9D9D9"/>
               <w:left w:val="single" w:sz="4" w:color="D9D9D9"/>
@@ -130,7 +156,8 @@
           </w:tcPr>
           <w:p>
             <w:pPr>
-              <w:jc w:val="center"/>
+              <w:spacing w:after="0" w:line="252" w:lineRule="auto"/>
+              <w:jc w:val="left"/>
             </w:pPr>
             <w:r/>
             <w:r>
@@ -147,19 +174,26 @@
       <w:tr>
         <w:tc>
           <w:tcPr>
-            <w:tcW w:type="dxa" w:w="4968"/>
+            <w:tcW w:type="dxa" w:w="2376"/>
             <w:vAlign w:val="center"/>
+            <w:tcMar>
+              <w:top w:w="90" w:type="dxa"/>
+              <w:start w:w="110" w:type="dxa"/>
+              <w:bottom w:w="90" w:type="dxa"/>
+              <w:end w:w="110" w:type="dxa"/>
+            </w:tcMar>
             <w:tcBorders>
               <w:top w:val="single" w:sz="4" w:color="D9D9D9"/>
               <w:left w:val="single" w:sz="4" w:color="D9D9D9"/>
               <w:bottom w:val="single" w:sz="4" w:color="D9D9D9"/>
               <w:right w:val="single" w:sz="4" w:color="D9D9D9"/>
             </w:tcBorders>
-            <w:shd w:fill="D9EAF7"/>
+            <w:shd w:fill="EAF2F8"/>
           </w:tcPr>
           <w:p>
             <w:pPr>
-              <w:jc w:val="center"/>
+              <w:spacing w:after="0" w:line="252" w:lineRule="auto"/>
+              <w:jc w:val="left"/>
             </w:pPr>
             <w:r/>
             <w:r>
@@ -174,8 +208,14 @@
         </w:tc>
         <w:tc>
           <w:tcPr>
-            <w:tcW w:type="dxa" w:w="4968"/>
+            <w:tcW w:type="dxa" w:w="7272"/>
             <w:vAlign w:val="center"/>
+            <w:tcMar>
+              <w:top w:w="90" w:type="dxa"/>
+              <w:start w:w="110" w:type="dxa"/>
+              <w:bottom w:w="90" w:type="dxa"/>
+              <w:end w:w="110" w:type="dxa"/>
+            </w:tcMar>
             <w:tcBorders>
               <w:top w:val="single" w:sz="4" w:color="D9D9D9"/>
               <w:left w:val="single" w:sz="4" w:color="D9D9D9"/>
@@ -185,7 +225,8 @@
           </w:tcPr>
           <w:p>
             <w:pPr>
-              <w:jc w:val="center"/>
+              <w:spacing w:after="0" w:line="252" w:lineRule="auto"/>
+              <w:jc w:val="left"/>
             </w:pPr>
             <w:r/>
             <w:r>
@@ -202,19 +243,26 @@
       <w:tr>
         <w:tc>
           <w:tcPr>
-            <w:tcW w:type="dxa" w:w="4968"/>
+            <w:tcW w:type="dxa" w:w="2376"/>
             <w:vAlign w:val="center"/>
+            <w:tcMar>
+              <w:top w:w="90" w:type="dxa"/>
+              <w:start w:w="110" w:type="dxa"/>
+              <w:bottom w:w="90" w:type="dxa"/>
+              <w:end w:w="110" w:type="dxa"/>
+            </w:tcMar>
             <w:tcBorders>
               <w:top w:val="single" w:sz="4" w:color="D9D9D9"/>
               <w:left w:val="single" w:sz="4" w:color="D9D9D9"/>
               <w:bottom w:val="single" w:sz="4" w:color="D9D9D9"/>
               <w:right w:val="single" w:sz="4" w:color="D9D9D9"/>
             </w:tcBorders>
-            <w:shd w:fill="D9EAF7"/>
+            <w:shd w:fill="EAF2F8"/>
           </w:tcPr>
           <w:p>
             <w:pPr>
-              <w:jc w:val="center"/>
+              <w:spacing w:after="0" w:line="252" w:lineRule="auto"/>
+              <w:jc w:val="left"/>
             </w:pPr>
             <w:r/>
             <w:r>
@@ -229,8 +277,14 @@
         </w:tc>
         <w:tc>
           <w:tcPr>
-            <w:tcW w:type="dxa" w:w="4968"/>
+            <w:tcW w:type="dxa" w:w="7272"/>
             <w:vAlign w:val="center"/>
+            <w:tcMar>
+              <w:top w:w="90" w:type="dxa"/>
+              <w:start w:w="110" w:type="dxa"/>
+              <w:bottom w:w="90" w:type="dxa"/>
+              <w:end w:w="110" w:type="dxa"/>
+            </w:tcMar>
             <w:tcBorders>
               <w:top w:val="single" w:sz="4" w:color="D9D9D9"/>
               <w:left w:val="single" w:sz="4" w:color="D9D9D9"/>
@@ -240,7 +294,8 @@
           </w:tcPr>
           <w:p>
             <w:pPr>
-              <w:jc w:val="center"/>
+              <w:spacing w:after="0" w:line="252" w:lineRule="auto"/>
+              <w:jc w:val="left"/>
             </w:pPr>
             <w:r/>
             <w:r>
@@ -257,19 +312,26 @@
       <w:tr>
         <w:tc>
           <w:tcPr>
-            <w:tcW w:type="dxa" w:w="4968"/>
+            <w:tcW w:type="dxa" w:w="2376"/>
             <w:vAlign w:val="center"/>
+            <w:tcMar>
+              <w:top w:w="90" w:type="dxa"/>
+              <w:start w:w="110" w:type="dxa"/>
+              <w:bottom w:w="90" w:type="dxa"/>
+              <w:end w:w="110" w:type="dxa"/>
+            </w:tcMar>
             <w:tcBorders>
               <w:top w:val="single" w:sz="4" w:color="D9D9D9"/>
               <w:left w:val="single" w:sz="4" w:color="D9D9D9"/>
               <w:bottom w:val="single" w:sz="4" w:color="D9D9D9"/>
               <w:right w:val="single" w:sz="4" w:color="D9D9D9"/>
             </w:tcBorders>
-            <w:shd w:fill="D9EAF7"/>
+            <w:shd w:fill="EAF2F8"/>
           </w:tcPr>
           <w:p>
             <w:pPr>
-              <w:jc w:val="center"/>
+              <w:spacing w:after="0" w:line="252" w:lineRule="auto"/>
+              <w:jc w:val="left"/>
             </w:pPr>
             <w:r/>
             <w:r>
@@ -284,8 +346,14 @@
         </w:tc>
         <w:tc>
           <w:tcPr>
-            <w:tcW w:type="dxa" w:w="4968"/>
+            <w:tcW w:type="dxa" w:w="7272"/>
             <w:vAlign w:val="center"/>
+            <w:tcMar>
+              <w:top w:w="90" w:type="dxa"/>
+              <w:start w:w="110" w:type="dxa"/>
+              <w:bottom w:w="90" w:type="dxa"/>
+              <w:end w:w="110" w:type="dxa"/>
+            </w:tcMar>
             <w:tcBorders>
               <w:top w:val="single" w:sz="4" w:color="D9D9D9"/>
               <w:left w:val="single" w:sz="4" w:color="D9D9D9"/>
@@ -295,7 +363,8 @@
           </w:tcPr>
           <w:p>
             <w:pPr>
-              <w:jc w:val="center"/>
+              <w:spacing w:after="0" w:line="252" w:lineRule="auto"/>
+              <w:jc w:val="left"/>
             </w:pPr>
             <w:r/>
             <w:r>
@@ -312,19 +381,26 @@
       <w:tr>
         <w:tc>
           <w:tcPr>
-            <w:tcW w:type="dxa" w:w="4968"/>
+            <w:tcW w:type="dxa" w:w="2376"/>
             <w:vAlign w:val="center"/>
+            <w:tcMar>
+              <w:top w:w="90" w:type="dxa"/>
+              <w:start w:w="110" w:type="dxa"/>
+              <w:bottom w:w="90" w:type="dxa"/>
+              <w:end w:w="110" w:type="dxa"/>
+            </w:tcMar>
             <w:tcBorders>
               <w:top w:val="single" w:sz="4" w:color="D9D9D9"/>
               <w:left w:val="single" w:sz="4" w:color="D9D9D9"/>
               <w:bottom w:val="single" w:sz="4" w:color="D9D9D9"/>
               <w:right w:val="single" w:sz="4" w:color="D9D9D9"/>
             </w:tcBorders>
-            <w:shd w:fill="D9EAF7"/>
+            <w:shd w:fill="EAF2F8"/>
           </w:tcPr>
           <w:p>
             <w:pPr>
-              <w:jc w:val="center"/>
+              <w:spacing w:after="0" w:line="252" w:lineRule="auto"/>
+              <w:jc w:val="left"/>
             </w:pPr>
             <w:r/>
             <w:r>
@@ -339,8 +415,14 @@
         </w:tc>
         <w:tc>
           <w:tcPr>
-            <w:tcW w:type="dxa" w:w="4968"/>
+            <w:tcW w:type="dxa" w:w="7272"/>
             <w:vAlign w:val="center"/>
+            <w:tcMar>
+              <w:top w:w="90" w:type="dxa"/>
+              <w:start w:w="110" w:type="dxa"/>
+              <w:bottom w:w="90" w:type="dxa"/>
+              <w:end w:w="110" w:type="dxa"/>
+            </w:tcMar>
             <w:tcBorders>
               <w:top w:val="single" w:sz="4" w:color="D9D9D9"/>
               <w:left w:val="single" w:sz="4" w:color="D9D9D9"/>
@@ -350,7 +432,8 @@
           </w:tcPr>
           <w:p>
             <w:pPr>
-              <w:jc w:val="center"/>
+              <w:spacing w:after="0" w:line="252" w:lineRule="auto"/>
+              <w:jc w:val="left"/>
             </w:pPr>
             <w:r/>
             <w:r>
@@ -367,19 +450,29 @@
     </w:tbl>
     <w:p>
       <w:pPr>
-        <w:spacing w:after="140" w:line="269" w:lineRule="auto"/>
+        <w:pStyle w:val="Heading1"/>
+        <w:keepNext/>
+      </w:pPr>
+      <w:r>
+        <w:t>Executive summary</w:t>
+      </w:r>
+    </w:p>
+    <w:p>
+      <w:pPr>
+        <w:spacing w:after="120" w:line="269" w:lineRule="auto"/>
       </w:pPr>
       <w:r>
         <w:rPr>
           <w:rFonts w:ascii="Arial" w:hAnsi="Arial"/>
           <w:sz w:val="21"/>
         </w:rPr>
-        <w:t>Executive summary. Four word-level autoregressive language models were trained on the full filtered OEDILF limerick corpus under comparable settings. The GRU achieved the strongest held-out next-word prediction performance and the best combined generation evidence. The recommended configuration is the GRU sampled at temperature 0.3.</w:t>
+        <w:t>Four word-level autoregressive models were trained on the filtered OEDILF limerick corpus under the same data split and core hyperparameters. GRU produced the lowest held-out perplexity at 45.30 and the highest top-1 and top-5 accuracy. In the generation sweep, GRU at temperature 0.3 produced five lines in every sample, had the strongest automatic AABBA rhyme score at 46.7%, and achieved a combined manual score of 3.0 out of 5. This configuration is the final recommendation, with the caveat that the manual sample was small and all generated models remained well below the human-reference rhyme score.</w:t>
       </w:r>
     </w:p>
     <w:p>
       <w:pPr>
         <w:pStyle w:val="Heading1"/>
+        <w:keepNext/>
       </w:pPr>
       <w:r>
         <w:t>1 Problem and objective</w:t>
@@ -387,19 +480,20 @@
     </w:p>
     <w:p>
       <w:pPr>
-        <w:spacing w:after="140" w:line="269" w:lineRule="auto"/>
+        <w:spacing w:after="120" w:line="269" w:lineRule="auto"/>
       </w:pPr>
       <w:r>
         <w:rPr>
           <w:rFonts w:ascii="Arial" w:hAnsi="Arial"/>
           <w:sz w:val="21"/>
         </w:rPr>
-        <w:t>The task was to develop an autoregressive text-generation system using Simple RNN, Bidirectional RNN, LSTM, and GRU architectures. Each model predicts the next word from its preceding context and generates text sequentially from the same seed sequences. The objectives were to compare predictive performance, generated-text quality, and the effect of sampling temperature.</w:t>
+        <w:t>The task was to build an autoregressive text-generation system using Simple RNN, Bidirectional RNN, LSTM, and GRU architectures. Each model predicts the next word from its preceding context and generates a poem one token at a time from a seed sequence. The comparison covers predictive performance, computational cost, generated-text quality, and the effect of sampling temperature.</w:t>
       </w:r>
     </w:p>
     <w:p>
       <w:pPr>
         <w:pStyle w:val="Heading1"/>
+        <w:keepNext/>
       </w:pPr>
       <w:r>
         <w:t>2 Dataset and preprocessing</w:t>
@@ -407,77 +501,82 @@
     </w:p>
     <w:p>
       <w:pPr>
-        <w:spacing w:after="140" w:line="269" w:lineRule="auto"/>
+        <w:spacing w:after="120" w:line="269" w:lineRule="auto"/>
       </w:pPr>
       <w:r>
         <w:rPr>
           <w:rFonts w:ascii="Arial" w:hAnsi="Arial"/>
           <w:sz w:val="21"/>
         </w:rPr>
-        <w:t>The Limerick Dataset OEDILF v3 was obtained from Zenodo under the CC BY 3.0 US licence. The source file contains 98,454 records, of which 65,886 were labelled as limericks and used in the final experiment. The data were split by poem into 80% training, 10% validation, and 10% test partitions, preventing token windows from the same poem appearing in multiple splits.</w:t>
+        <w:t>The Limerick Dataset OEDILF v3 was obtained from Zenodo under the CC BY 3.0 US licence. The source contains 98,454 records. After filtering by the supplied limerick label, 65,886 poems remained. Splitting was performed by poem before sequence construction, using 80% for training and 10% each for validation and test. This prevents token windows from the same poem from appearing in more than one partition.</w:t>
       </w:r>
     </w:p>
     <w:p>
       <w:pPr>
-        <w:spacing w:after="140" w:line="269" w:lineRule="auto"/>
+        <w:spacing w:after="120" w:line="269" w:lineRule="auto"/>
       </w:pPr>
       <w:r>
         <w:rPr>
           <w:rFonts w:ascii="Arial" w:hAnsi="Arial"/>
           <w:sz w:val="21"/>
         </w:rPr>
-        <w:t>Text was lowercased and tokenised into words and punctuation. Each poem received beginning-of-sequence, end-of-line, and end-of-sequence tokens. A vocabulary of up to 10,000 training-set tokens was created, with pad and unknown tokens retained. Each target token was paired with a 64-token left context, creating next-word input-target examples.</w:t>
+        <w:t>Text was lowercased and tokenised into words and punctuation. Each poem received beginning-of-sequence, end-of-line, and end-of-sequence tokens. The training vocabulary was capped at 10,000 tokens and retained pad and unknown tokens. A 64-token left context was paired with each target token, yielding 2,229,796 training, 279,120 validation, and 278,760 test examples.</w:t>
+      </w:r>
+    </w:p>
+    <w:p>
+      <w:r>
+        <w:br w:type="page"/>
       </w:r>
     </w:p>
     <w:p>
       <w:pPr>
         <w:pStyle w:val="Heading1"/>
+        <w:keepNext/>
       </w:pPr>
       <w:r>
-        <w:t>3 Models and experimental protocol</w:t>
+        <w:t>3 Model architectures</w:t>
       </w:r>
     </w:p>
     <w:p>
       <w:pPr>
-        <w:spacing w:after="140" w:line="269" w:lineRule="auto"/>
+        <w:spacing w:after="120" w:line="269" w:lineRule="auto"/>
       </w:pPr>
       <w:r>
         <w:rPr>
           <w:rFonts w:ascii="Arial" w:hAnsi="Arial"/>
           <w:sz w:val="21"/>
         </w:rPr>
-        <w:t>The Simple RNN, Bidirectional RNN, LSTM, and GRU each used 128-dimensional embeddings, 256 hidden units, dropout 0.3, Adam optimisation with learning rate 0.001, batch size 512, a 64-token context, and random seed 42. Training was capped at 40 epochs with validation-loss early stopping (patience 5). The best validation checkpoint for each model was evaluated once on the held-out test set.</w:t>
-      </w:r>
-    </w:p>
-    <w:p>
-      <w:pPr>
-        <w:pStyle w:val="Heading1"/>
-      </w:pPr>
-      <w:r>
-        <w:t>4 Quantitative comparison</w:t>
+        <w:t>All four models shared the same input representation and output layer. A 128-dimensional embedding maps token indices to dense vectors. The recurrent layer uses 256 hidden units and dropout of 0.3. A linear projection then maps the recurrent representation to the 10,000-token vocabulary.</w:t>
       </w:r>
     </w:p>
     <w:tbl>
       <w:tblPr>
-        <w:tblStyle w:val="TableGrid"/>
         <w:tblW w:type="auto" w:w="0"/>
         <w:jc w:val="center"/>
+        <w:tblLayout w:type="fixed"/>
         <w:tblLook w:firstColumn="1" w:firstRow="1" w:lastColumn="0" w:lastRow="0" w:noHBand="0" w:noVBand="1" w:val="04A0"/>
       </w:tblPr>
       <w:tblGrid>
-        <w:gridCol w:w="1419"/>
-        <w:gridCol w:w="1419"/>
-        <w:gridCol w:w="1419"/>
-        <w:gridCol w:w="1419"/>
-        <w:gridCol w:w="1419"/>
-        <w:gridCol w:w="1419"/>
-        <w:gridCol w:w="1419"/>
+        <w:gridCol w:w="1999"/>
+        <w:gridCol w:w="1999"/>
+        <w:gridCol w:w="1999"/>
+        <w:gridCol w:w="1999"/>
+        <w:gridCol w:w="1999"/>
       </w:tblGrid>
       <w:tr>
+        <w:trPr>
+          <w:tblHeader w:val="true"/>
+        </w:trPr>
         <w:tc>
           <w:tcPr>
-            <w:tcW w:type="dxa" w:w="1419"/>
+            <w:tcW w:type="dxa" w:w="1440"/>
             <w:vAlign w:val="center"/>
+            <w:tcMar>
+              <w:top w:w="90" w:type="dxa"/>
+              <w:start w:w="110" w:type="dxa"/>
+              <w:bottom w:w="90" w:type="dxa"/>
+              <w:end w:w="110" w:type="dxa"/>
+            </w:tcMar>
             <w:tcBorders>
               <w:top w:val="single" w:sz="4" w:color="D9D9D9"/>
               <w:left w:val="single" w:sz="4" w:color="D9D9D9"/>
@@ -488,6 +587,7 @@
           </w:tcPr>
           <w:p>
             <w:pPr>
+              <w:spacing w:after="0" w:line="252" w:lineRule="auto"/>
               <w:jc w:val="center"/>
             </w:pPr>
             <w:r/>
@@ -496,7 +596,7 @@
                 <w:rFonts w:ascii="Arial" w:hAnsi="Arial"/>
                 <w:b/>
                 <w:color w:val="FFFFFF"/>
-                <w:sz w:val="18"/>
+                <w:sz w:val="16"/>
               </w:rPr>
               <w:t>Model</w:t>
             </w:r>
@@ -504,8 +604,14 @@
         </w:tc>
         <w:tc>
           <w:tcPr>
-            <w:tcW w:type="dxa" w:w="1419"/>
+            <w:tcW w:type="dxa" w:w="1800"/>
             <w:vAlign w:val="center"/>
+            <w:tcMar>
+              <w:top w:w="90" w:type="dxa"/>
+              <w:start w:w="110" w:type="dxa"/>
+              <w:bottom w:w="90" w:type="dxa"/>
+              <w:end w:w="110" w:type="dxa"/>
+            </w:tcMar>
             <w:tcBorders>
               <w:top w:val="single" w:sz="4" w:color="D9D9D9"/>
               <w:left w:val="single" w:sz="4" w:color="D9D9D9"/>
@@ -516,6 +622,7 @@
           </w:tcPr>
           <w:p>
             <w:pPr>
+              <w:spacing w:after="0" w:line="252" w:lineRule="auto"/>
               <w:jc w:val="center"/>
             </w:pPr>
             <w:r/>
@@ -524,16 +631,22 @@
                 <w:rFonts w:ascii="Arial" w:hAnsi="Arial"/>
                 <w:b/>
                 <w:color w:val="FFFFFF"/>
-                <w:sz w:val="18"/>
+                <w:sz w:val="16"/>
               </w:rPr>
-              <w:t>Epochs</w:t>
+              <w:t>Recurrent layer</w:t>
             </w:r>
           </w:p>
         </w:tc>
         <w:tc>
           <w:tcPr>
-            <w:tcW w:type="dxa" w:w="1419"/>
+            <w:tcW w:type="dxa" w:w="1944"/>
             <w:vAlign w:val="center"/>
+            <w:tcMar>
+              <w:top w:w="90" w:type="dxa"/>
+              <w:start w:w="110" w:type="dxa"/>
+              <w:bottom w:w="90" w:type="dxa"/>
+              <w:end w:w="110" w:type="dxa"/>
+            </w:tcMar>
             <w:tcBorders>
               <w:top w:val="single" w:sz="4" w:color="D9D9D9"/>
               <w:left w:val="single" w:sz="4" w:color="D9D9D9"/>
@@ -544,6 +657,7 @@
           </w:tcPr>
           <w:p>
             <w:pPr>
+              <w:spacing w:after="0" w:line="252" w:lineRule="auto"/>
               <w:jc w:val="center"/>
             </w:pPr>
             <w:r/>
@@ -552,16 +666,22 @@
                 <w:rFonts w:ascii="Arial" w:hAnsi="Arial"/>
                 <w:b/>
                 <w:color w:val="FFFFFF"/>
-                <w:sz w:val="18"/>
+                <w:sz w:val="16"/>
               </w:rPr>
-              <w:t>Parameters</w:t>
+              <w:t>Output width</w:t>
             </w:r>
           </w:p>
         </w:tc>
         <w:tc>
           <w:tcPr>
-            <w:tcW w:type="dxa" w:w="1419"/>
+            <w:tcW w:type="dxa" w:w="2736"/>
             <w:vAlign w:val="center"/>
+            <w:tcMar>
+              <w:top w:w="90" w:type="dxa"/>
+              <w:start w:w="110" w:type="dxa"/>
+              <w:bottom w:w="90" w:type="dxa"/>
+              <w:end w:w="110" w:type="dxa"/>
+            </w:tcMar>
             <w:tcBorders>
               <w:top w:val="single" w:sz="4" w:color="D9D9D9"/>
               <w:left w:val="single" w:sz="4" w:color="D9D9D9"/>
@@ -572,6 +692,7 @@
           </w:tcPr>
           <w:p>
             <w:pPr>
+              <w:spacing w:after="0" w:line="252" w:lineRule="auto"/>
               <w:jc w:val="center"/>
             </w:pPr>
             <w:r/>
@@ -580,16 +701,22 @@
                 <w:rFonts w:ascii="Arial" w:hAnsi="Arial"/>
                 <w:b/>
                 <w:color w:val="FFFFFF"/>
-                <w:sz w:val="18"/>
+                <w:sz w:val="16"/>
               </w:rPr>
-              <w:t>Test PPL</w:t>
+              <w:t>Sequence representation</w:t>
             </w:r>
           </w:p>
         </w:tc>
         <w:tc>
           <w:tcPr>
-            <w:tcW w:type="dxa" w:w="1419"/>
+            <w:tcW w:type="dxa" w:w="1800"/>
             <w:vAlign w:val="center"/>
+            <w:tcMar>
+              <w:top w:w="90" w:type="dxa"/>
+              <w:start w:w="110" w:type="dxa"/>
+              <w:bottom w:w="90" w:type="dxa"/>
+              <w:end w:w="110" w:type="dxa"/>
+            </w:tcMar>
             <w:tcBorders>
               <w:top w:val="single" w:sz="4" w:color="D9D9D9"/>
               <w:left w:val="single" w:sz="4" w:color="D9D9D9"/>
@@ -600,6 +727,7 @@
           </w:tcPr>
           <w:p>
             <w:pPr>
+              <w:spacing w:after="0" w:line="252" w:lineRule="auto"/>
               <w:jc w:val="center"/>
             </w:pPr>
             <w:r/>
@@ -608,16 +736,833 @@
                 <w:rFonts w:ascii="Arial" w:hAnsi="Arial"/>
                 <w:b/>
                 <w:color w:val="FFFFFF"/>
-                <w:sz w:val="18"/>
+                <w:sz w:val="16"/>
               </w:rPr>
-              <w:t>Top-1</w:t>
+              <w:t>Parameters</w:t>
+            </w:r>
+          </w:p>
+        </w:tc>
+      </w:tr>
+      <w:tr>
+        <w:tc>
+          <w:tcPr>
+            <w:tcW w:type="dxa" w:w="1999"/>
+            <w:vAlign w:val="center"/>
+            <w:tcMar>
+              <w:top w:w="90" w:type="dxa"/>
+              <w:start w:w="110" w:type="dxa"/>
+              <w:bottom w:w="90" w:type="dxa"/>
+              <w:end w:w="110" w:type="dxa"/>
+            </w:tcMar>
+            <w:tcBorders>
+              <w:top w:val="single" w:sz="4" w:color="D9D9D9"/>
+              <w:left w:val="single" w:sz="4" w:color="D9D9D9"/>
+              <w:bottom w:val="single" w:sz="4" w:color="D9D9D9"/>
+              <w:right w:val="single" w:sz="4" w:color="D9D9D9"/>
+            </w:tcBorders>
+          </w:tcPr>
+          <w:p>
+            <w:pPr>
+              <w:spacing w:after="0" w:line="252" w:lineRule="auto"/>
+              <w:jc w:val="center"/>
+            </w:pPr>
+            <w:r/>
+            <w:r>
+              <w:rPr>
+                <w:rFonts w:ascii="Arial" w:hAnsi="Arial"/>
+                <w:b w:val="0"/>
+                <w:sz w:val="17"/>
+              </w:rPr>
+              <w:t>Simple RNN</w:t>
             </w:r>
           </w:p>
         </w:tc>
         <w:tc>
           <w:tcPr>
-            <w:tcW w:type="dxa" w:w="1419"/>
+            <w:tcW w:type="dxa" w:w="1999"/>
             <w:vAlign w:val="center"/>
+            <w:tcMar>
+              <w:top w:w="90" w:type="dxa"/>
+              <w:start w:w="110" w:type="dxa"/>
+              <w:bottom w:w="90" w:type="dxa"/>
+              <w:end w:w="110" w:type="dxa"/>
+            </w:tcMar>
+            <w:tcBorders>
+              <w:top w:val="single" w:sz="4" w:color="D9D9D9"/>
+              <w:left w:val="single" w:sz="4" w:color="D9D9D9"/>
+              <w:bottom w:val="single" w:sz="4" w:color="D9D9D9"/>
+              <w:right w:val="single" w:sz="4" w:color="D9D9D9"/>
+            </w:tcBorders>
+          </w:tcPr>
+          <w:p>
+            <w:pPr>
+              <w:spacing w:after="0" w:line="252" w:lineRule="auto"/>
+              <w:jc w:val="center"/>
+            </w:pPr>
+            <w:r/>
+            <w:r>
+              <w:rPr>
+                <w:rFonts w:ascii="Arial" w:hAnsi="Arial"/>
+                <w:b w:val="0"/>
+                <w:sz w:val="17"/>
+              </w:rPr>
+              <w:t>RNN 256</w:t>
+            </w:r>
+          </w:p>
+        </w:tc>
+        <w:tc>
+          <w:tcPr>
+            <w:tcW w:type="dxa" w:w="1999"/>
+            <w:vAlign w:val="center"/>
+            <w:tcMar>
+              <w:top w:w="90" w:type="dxa"/>
+              <w:start w:w="110" w:type="dxa"/>
+              <w:bottom w:w="90" w:type="dxa"/>
+              <w:end w:w="110" w:type="dxa"/>
+            </w:tcMar>
+            <w:tcBorders>
+              <w:top w:val="single" w:sz="4" w:color="D9D9D9"/>
+              <w:left w:val="single" w:sz="4" w:color="D9D9D9"/>
+              <w:bottom w:val="single" w:sz="4" w:color="D9D9D9"/>
+              <w:right w:val="single" w:sz="4" w:color="D9D9D9"/>
+            </w:tcBorders>
+          </w:tcPr>
+          <w:p>
+            <w:pPr>
+              <w:spacing w:after="0" w:line="252" w:lineRule="auto"/>
+              <w:jc w:val="center"/>
+            </w:pPr>
+            <w:r/>
+            <w:r>
+              <w:rPr>
+                <w:rFonts w:ascii="Arial" w:hAnsi="Arial"/>
+                <w:b w:val="0"/>
+                <w:sz w:val="17"/>
+              </w:rPr>
+              <w:t>256</w:t>
+            </w:r>
+          </w:p>
+        </w:tc>
+        <w:tc>
+          <w:tcPr>
+            <w:tcW w:type="dxa" w:w="1999"/>
+            <w:vAlign w:val="center"/>
+            <w:tcMar>
+              <w:top w:w="90" w:type="dxa"/>
+              <w:start w:w="110" w:type="dxa"/>
+              <w:bottom w:w="90" w:type="dxa"/>
+              <w:end w:w="110" w:type="dxa"/>
+            </w:tcMar>
+            <w:tcBorders>
+              <w:top w:val="single" w:sz="4" w:color="D9D9D9"/>
+              <w:left w:val="single" w:sz="4" w:color="D9D9D9"/>
+              <w:bottom w:val="single" w:sz="4" w:color="D9D9D9"/>
+              <w:right w:val="single" w:sz="4" w:color="D9D9D9"/>
+            </w:tcBorders>
+          </w:tcPr>
+          <w:p>
+            <w:pPr>
+              <w:spacing w:after="0" w:line="252" w:lineRule="auto"/>
+              <w:jc w:val="left"/>
+            </w:pPr>
+            <w:r/>
+            <w:r>
+              <w:rPr>
+                <w:rFonts w:ascii="Arial" w:hAnsi="Arial"/>
+                <w:b w:val="0"/>
+                <w:sz w:val="17"/>
+              </w:rPr>
+              <w:t>Final forward hidden state</w:t>
+            </w:r>
+          </w:p>
+        </w:tc>
+        <w:tc>
+          <w:tcPr>
+            <w:tcW w:type="dxa" w:w="1999"/>
+            <w:vAlign w:val="center"/>
+            <w:tcMar>
+              <w:top w:w="90" w:type="dxa"/>
+              <w:start w:w="110" w:type="dxa"/>
+              <w:bottom w:w="90" w:type="dxa"/>
+              <w:end w:w="110" w:type="dxa"/>
+            </w:tcMar>
+            <w:tcBorders>
+              <w:top w:val="single" w:sz="4" w:color="D9D9D9"/>
+              <w:left w:val="single" w:sz="4" w:color="D9D9D9"/>
+              <w:bottom w:val="single" w:sz="4" w:color="D9D9D9"/>
+              <w:right w:val="single" w:sz="4" w:color="D9D9D9"/>
+            </w:tcBorders>
+          </w:tcPr>
+          <w:p>
+            <w:pPr>
+              <w:spacing w:after="0" w:line="252" w:lineRule="auto"/>
+              <w:jc w:val="center"/>
+            </w:pPr>
+            <w:r/>
+            <w:r>
+              <w:rPr>
+                <w:rFonts w:ascii="Arial" w:hAnsi="Arial"/>
+                <w:b w:val="0"/>
+                <w:sz w:val="17"/>
+              </w:rPr>
+              <w:t>3.95M</w:t>
+            </w:r>
+          </w:p>
+        </w:tc>
+      </w:tr>
+      <w:tr>
+        <w:tc>
+          <w:tcPr>
+            <w:tcW w:type="dxa" w:w="1999"/>
+            <w:shd w:fill="F5F7F9"/>
+            <w:vAlign w:val="center"/>
+            <w:tcMar>
+              <w:top w:w="90" w:type="dxa"/>
+              <w:start w:w="110" w:type="dxa"/>
+              <w:bottom w:w="90" w:type="dxa"/>
+              <w:end w:w="110" w:type="dxa"/>
+            </w:tcMar>
+            <w:tcBorders>
+              <w:top w:val="single" w:sz="4" w:color="D9D9D9"/>
+              <w:left w:val="single" w:sz="4" w:color="D9D9D9"/>
+              <w:bottom w:val="single" w:sz="4" w:color="D9D9D9"/>
+              <w:right w:val="single" w:sz="4" w:color="D9D9D9"/>
+            </w:tcBorders>
+          </w:tcPr>
+          <w:p>
+            <w:pPr>
+              <w:spacing w:after="0" w:line="252" w:lineRule="auto"/>
+              <w:jc w:val="center"/>
+            </w:pPr>
+            <w:r/>
+            <w:r>
+              <w:rPr>
+                <w:rFonts w:ascii="Arial" w:hAnsi="Arial"/>
+                <w:b w:val="0"/>
+                <w:sz w:val="17"/>
+              </w:rPr>
+              <w:t>BiRNN</w:t>
+            </w:r>
+          </w:p>
+        </w:tc>
+        <w:tc>
+          <w:tcPr>
+            <w:tcW w:type="dxa" w:w="1999"/>
+            <w:shd w:fill="F5F7F9"/>
+            <w:vAlign w:val="center"/>
+            <w:tcMar>
+              <w:top w:w="90" w:type="dxa"/>
+              <w:start w:w="110" w:type="dxa"/>
+              <w:bottom w:w="90" w:type="dxa"/>
+              <w:end w:w="110" w:type="dxa"/>
+            </w:tcMar>
+            <w:tcBorders>
+              <w:top w:val="single" w:sz="4" w:color="D9D9D9"/>
+              <w:left w:val="single" w:sz="4" w:color="D9D9D9"/>
+              <w:bottom w:val="single" w:sz="4" w:color="D9D9D9"/>
+              <w:right w:val="single" w:sz="4" w:color="D9D9D9"/>
+            </w:tcBorders>
+          </w:tcPr>
+          <w:p>
+            <w:pPr>
+              <w:spacing w:after="0" w:line="252" w:lineRule="auto"/>
+              <w:jc w:val="center"/>
+            </w:pPr>
+            <w:r/>
+            <w:r>
+              <w:rPr>
+                <w:rFonts w:ascii="Arial" w:hAnsi="Arial"/>
+                <w:b w:val="0"/>
+                <w:sz w:val="17"/>
+              </w:rPr>
+              <w:t>Bidirectional RNN 256</w:t>
+            </w:r>
+          </w:p>
+        </w:tc>
+        <w:tc>
+          <w:tcPr>
+            <w:tcW w:type="dxa" w:w="1999"/>
+            <w:shd w:fill="F5F7F9"/>
+            <w:vAlign w:val="center"/>
+            <w:tcMar>
+              <w:top w:w="90" w:type="dxa"/>
+              <w:start w:w="110" w:type="dxa"/>
+              <w:bottom w:w="90" w:type="dxa"/>
+              <w:end w:w="110" w:type="dxa"/>
+            </w:tcMar>
+            <w:tcBorders>
+              <w:top w:val="single" w:sz="4" w:color="D9D9D9"/>
+              <w:left w:val="single" w:sz="4" w:color="D9D9D9"/>
+              <w:bottom w:val="single" w:sz="4" w:color="D9D9D9"/>
+              <w:right w:val="single" w:sz="4" w:color="D9D9D9"/>
+            </w:tcBorders>
+          </w:tcPr>
+          <w:p>
+            <w:pPr>
+              <w:spacing w:after="0" w:line="252" w:lineRule="auto"/>
+              <w:jc w:val="center"/>
+            </w:pPr>
+            <w:r/>
+            <w:r>
+              <w:rPr>
+                <w:rFonts w:ascii="Arial" w:hAnsi="Arial"/>
+                <w:b w:val="0"/>
+                <w:sz w:val="17"/>
+              </w:rPr>
+              <w:t>512</w:t>
+            </w:r>
+          </w:p>
+        </w:tc>
+        <w:tc>
+          <w:tcPr>
+            <w:tcW w:type="dxa" w:w="1999"/>
+            <w:shd w:fill="F5F7F9"/>
+            <w:vAlign w:val="center"/>
+            <w:tcMar>
+              <w:top w:w="90" w:type="dxa"/>
+              <w:start w:w="110" w:type="dxa"/>
+              <w:bottom w:w="90" w:type="dxa"/>
+              <w:end w:w="110" w:type="dxa"/>
+            </w:tcMar>
+            <w:tcBorders>
+              <w:top w:val="single" w:sz="4" w:color="D9D9D9"/>
+              <w:left w:val="single" w:sz="4" w:color="D9D9D9"/>
+              <w:bottom w:val="single" w:sz="4" w:color="D9D9D9"/>
+              <w:right w:val="single" w:sz="4" w:color="D9D9D9"/>
+            </w:tcBorders>
+          </w:tcPr>
+          <w:p>
+            <w:pPr>
+              <w:spacing w:after="0" w:line="252" w:lineRule="auto"/>
+              <w:jc w:val="left"/>
+            </w:pPr>
+            <w:r/>
+            <w:r>
+              <w:rPr>
+                <w:rFonts w:ascii="Arial" w:hAnsi="Arial"/>
+                <w:b w:val="0"/>
+                <w:sz w:val="17"/>
+              </w:rPr>
+              <w:t>Concatenated forward and backward states</w:t>
+            </w:r>
+          </w:p>
+        </w:tc>
+        <w:tc>
+          <w:tcPr>
+            <w:tcW w:type="dxa" w:w="1999"/>
+            <w:shd w:fill="F5F7F9"/>
+            <w:vAlign w:val="center"/>
+            <w:tcMar>
+              <w:top w:w="90" w:type="dxa"/>
+              <w:start w:w="110" w:type="dxa"/>
+              <w:bottom w:w="90" w:type="dxa"/>
+              <w:end w:w="110" w:type="dxa"/>
+            </w:tcMar>
+            <w:tcBorders>
+              <w:top w:val="single" w:sz="4" w:color="D9D9D9"/>
+              <w:left w:val="single" w:sz="4" w:color="D9D9D9"/>
+              <w:bottom w:val="single" w:sz="4" w:color="D9D9D9"/>
+              <w:right w:val="single" w:sz="4" w:color="D9D9D9"/>
+            </w:tcBorders>
+          </w:tcPr>
+          <w:p>
+            <w:pPr>
+              <w:spacing w:after="0" w:line="252" w:lineRule="auto"/>
+              <w:jc w:val="center"/>
+            </w:pPr>
+            <w:r/>
+            <w:r>
+              <w:rPr>
+                <w:rFonts w:ascii="Arial" w:hAnsi="Arial"/>
+                <w:b w:val="0"/>
+                <w:sz w:val="17"/>
+              </w:rPr>
+              <w:t>6.61M</w:t>
+            </w:r>
+          </w:p>
+        </w:tc>
+      </w:tr>
+      <w:tr>
+        <w:tc>
+          <w:tcPr>
+            <w:tcW w:type="dxa" w:w="1999"/>
+            <w:vAlign w:val="center"/>
+            <w:tcMar>
+              <w:top w:w="90" w:type="dxa"/>
+              <w:start w:w="110" w:type="dxa"/>
+              <w:bottom w:w="90" w:type="dxa"/>
+              <w:end w:w="110" w:type="dxa"/>
+            </w:tcMar>
+            <w:tcBorders>
+              <w:top w:val="single" w:sz="4" w:color="D9D9D9"/>
+              <w:left w:val="single" w:sz="4" w:color="D9D9D9"/>
+              <w:bottom w:val="single" w:sz="4" w:color="D9D9D9"/>
+              <w:right w:val="single" w:sz="4" w:color="D9D9D9"/>
+            </w:tcBorders>
+          </w:tcPr>
+          <w:p>
+            <w:pPr>
+              <w:spacing w:after="0" w:line="252" w:lineRule="auto"/>
+              <w:jc w:val="center"/>
+            </w:pPr>
+            <w:r/>
+            <w:r>
+              <w:rPr>
+                <w:rFonts w:ascii="Arial" w:hAnsi="Arial"/>
+                <w:b w:val="0"/>
+                <w:sz w:val="17"/>
+              </w:rPr>
+              <w:t>LSTM</w:t>
+            </w:r>
+          </w:p>
+        </w:tc>
+        <w:tc>
+          <w:tcPr>
+            <w:tcW w:type="dxa" w:w="1999"/>
+            <w:vAlign w:val="center"/>
+            <w:tcMar>
+              <w:top w:w="90" w:type="dxa"/>
+              <w:start w:w="110" w:type="dxa"/>
+              <w:bottom w:w="90" w:type="dxa"/>
+              <w:end w:w="110" w:type="dxa"/>
+            </w:tcMar>
+            <w:tcBorders>
+              <w:top w:val="single" w:sz="4" w:color="D9D9D9"/>
+              <w:left w:val="single" w:sz="4" w:color="D9D9D9"/>
+              <w:bottom w:val="single" w:sz="4" w:color="D9D9D9"/>
+              <w:right w:val="single" w:sz="4" w:color="D9D9D9"/>
+            </w:tcBorders>
+          </w:tcPr>
+          <w:p>
+            <w:pPr>
+              <w:spacing w:after="0" w:line="252" w:lineRule="auto"/>
+              <w:jc w:val="center"/>
+            </w:pPr>
+            <w:r/>
+            <w:r>
+              <w:rPr>
+                <w:rFonts w:ascii="Arial" w:hAnsi="Arial"/>
+                <w:b w:val="0"/>
+                <w:sz w:val="17"/>
+              </w:rPr>
+              <w:t>LSTM 256</w:t>
+            </w:r>
+          </w:p>
+        </w:tc>
+        <w:tc>
+          <w:tcPr>
+            <w:tcW w:type="dxa" w:w="1999"/>
+            <w:vAlign w:val="center"/>
+            <w:tcMar>
+              <w:top w:w="90" w:type="dxa"/>
+              <w:start w:w="110" w:type="dxa"/>
+              <w:bottom w:w="90" w:type="dxa"/>
+              <w:end w:w="110" w:type="dxa"/>
+            </w:tcMar>
+            <w:tcBorders>
+              <w:top w:val="single" w:sz="4" w:color="D9D9D9"/>
+              <w:left w:val="single" w:sz="4" w:color="D9D9D9"/>
+              <w:bottom w:val="single" w:sz="4" w:color="D9D9D9"/>
+              <w:right w:val="single" w:sz="4" w:color="D9D9D9"/>
+            </w:tcBorders>
+          </w:tcPr>
+          <w:p>
+            <w:pPr>
+              <w:spacing w:after="0" w:line="252" w:lineRule="auto"/>
+              <w:jc w:val="center"/>
+            </w:pPr>
+            <w:r/>
+            <w:r>
+              <w:rPr>
+                <w:rFonts w:ascii="Arial" w:hAnsi="Arial"/>
+                <w:b w:val="0"/>
+                <w:sz w:val="17"/>
+              </w:rPr>
+              <w:t>256</w:t>
+            </w:r>
+          </w:p>
+        </w:tc>
+        <w:tc>
+          <w:tcPr>
+            <w:tcW w:type="dxa" w:w="1999"/>
+            <w:vAlign w:val="center"/>
+            <w:tcMar>
+              <w:top w:w="90" w:type="dxa"/>
+              <w:start w:w="110" w:type="dxa"/>
+              <w:bottom w:w="90" w:type="dxa"/>
+              <w:end w:w="110" w:type="dxa"/>
+            </w:tcMar>
+            <w:tcBorders>
+              <w:top w:val="single" w:sz="4" w:color="D9D9D9"/>
+              <w:left w:val="single" w:sz="4" w:color="D9D9D9"/>
+              <w:bottom w:val="single" w:sz="4" w:color="D9D9D9"/>
+              <w:right w:val="single" w:sz="4" w:color="D9D9D9"/>
+            </w:tcBorders>
+          </w:tcPr>
+          <w:p>
+            <w:pPr>
+              <w:spacing w:after="0" w:line="252" w:lineRule="auto"/>
+              <w:jc w:val="left"/>
+            </w:pPr>
+            <w:r/>
+            <w:r>
+              <w:rPr>
+                <w:rFonts w:ascii="Arial" w:hAnsi="Arial"/>
+                <w:b w:val="0"/>
+                <w:sz w:val="17"/>
+              </w:rPr>
+              <w:t>Final hidden state</w:t>
+            </w:r>
+          </w:p>
+        </w:tc>
+        <w:tc>
+          <w:tcPr>
+            <w:tcW w:type="dxa" w:w="1999"/>
+            <w:vAlign w:val="center"/>
+            <w:tcMar>
+              <w:top w:w="90" w:type="dxa"/>
+              <w:start w:w="110" w:type="dxa"/>
+              <w:bottom w:w="90" w:type="dxa"/>
+              <w:end w:w="110" w:type="dxa"/>
+            </w:tcMar>
+            <w:tcBorders>
+              <w:top w:val="single" w:sz="4" w:color="D9D9D9"/>
+              <w:left w:val="single" w:sz="4" w:color="D9D9D9"/>
+              <w:bottom w:val="single" w:sz="4" w:color="D9D9D9"/>
+              <w:right w:val="single" w:sz="4" w:color="D9D9D9"/>
+            </w:tcBorders>
+          </w:tcPr>
+          <w:p>
+            <w:pPr>
+              <w:spacing w:after="0" w:line="252" w:lineRule="auto"/>
+              <w:jc w:val="center"/>
+            </w:pPr>
+            <w:r/>
+            <w:r>
+              <w:rPr>
+                <w:rFonts w:ascii="Arial" w:hAnsi="Arial"/>
+                <w:b w:val="0"/>
+                <w:sz w:val="17"/>
+              </w:rPr>
+              <w:t>4.25M</w:t>
+            </w:r>
+          </w:p>
+        </w:tc>
+      </w:tr>
+      <w:tr>
+        <w:tc>
+          <w:tcPr>
+            <w:tcW w:type="dxa" w:w="1999"/>
+            <w:shd w:fill="F5F7F9"/>
+            <w:vAlign w:val="center"/>
+            <w:tcMar>
+              <w:top w:w="90" w:type="dxa"/>
+              <w:start w:w="110" w:type="dxa"/>
+              <w:bottom w:w="90" w:type="dxa"/>
+              <w:end w:w="110" w:type="dxa"/>
+            </w:tcMar>
+            <w:tcBorders>
+              <w:top w:val="single" w:sz="4" w:color="D9D9D9"/>
+              <w:left w:val="single" w:sz="4" w:color="D9D9D9"/>
+              <w:bottom w:val="single" w:sz="4" w:color="D9D9D9"/>
+              <w:right w:val="single" w:sz="4" w:color="D9D9D9"/>
+            </w:tcBorders>
+          </w:tcPr>
+          <w:p>
+            <w:pPr>
+              <w:spacing w:after="0" w:line="252" w:lineRule="auto"/>
+              <w:jc w:val="center"/>
+            </w:pPr>
+            <w:r/>
+            <w:r>
+              <w:rPr>
+                <w:rFonts w:ascii="Arial" w:hAnsi="Arial"/>
+                <w:b w:val="0"/>
+                <w:sz w:val="17"/>
+              </w:rPr>
+              <w:t>GRU</w:t>
+            </w:r>
+          </w:p>
+        </w:tc>
+        <w:tc>
+          <w:tcPr>
+            <w:tcW w:type="dxa" w:w="1999"/>
+            <w:shd w:fill="F5F7F9"/>
+            <w:vAlign w:val="center"/>
+            <w:tcMar>
+              <w:top w:w="90" w:type="dxa"/>
+              <w:start w:w="110" w:type="dxa"/>
+              <w:bottom w:w="90" w:type="dxa"/>
+              <w:end w:w="110" w:type="dxa"/>
+            </w:tcMar>
+            <w:tcBorders>
+              <w:top w:val="single" w:sz="4" w:color="D9D9D9"/>
+              <w:left w:val="single" w:sz="4" w:color="D9D9D9"/>
+              <w:bottom w:val="single" w:sz="4" w:color="D9D9D9"/>
+              <w:right w:val="single" w:sz="4" w:color="D9D9D9"/>
+            </w:tcBorders>
+          </w:tcPr>
+          <w:p>
+            <w:pPr>
+              <w:spacing w:after="0" w:line="252" w:lineRule="auto"/>
+              <w:jc w:val="center"/>
+            </w:pPr>
+            <w:r/>
+            <w:r>
+              <w:rPr>
+                <w:rFonts w:ascii="Arial" w:hAnsi="Arial"/>
+                <w:b w:val="0"/>
+                <w:sz w:val="17"/>
+              </w:rPr>
+              <w:t>GRU 256</w:t>
+            </w:r>
+          </w:p>
+        </w:tc>
+        <w:tc>
+          <w:tcPr>
+            <w:tcW w:type="dxa" w:w="1999"/>
+            <w:shd w:fill="F5F7F9"/>
+            <w:vAlign w:val="center"/>
+            <w:tcMar>
+              <w:top w:w="90" w:type="dxa"/>
+              <w:start w:w="110" w:type="dxa"/>
+              <w:bottom w:w="90" w:type="dxa"/>
+              <w:end w:w="110" w:type="dxa"/>
+            </w:tcMar>
+            <w:tcBorders>
+              <w:top w:val="single" w:sz="4" w:color="D9D9D9"/>
+              <w:left w:val="single" w:sz="4" w:color="D9D9D9"/>
+              <w:bottom w:val="single" w:sz="4" w:color="D9D9D9"/>
+              <w:right w:val="single" w:sz="4" w:color="D9D9D9"/>
+            </w:tcBorders>
+          </w:tcPr>
+          <w:p>
+            <w:pPr>
+              <w:spacing w:after="0" w:line="252" w:lineRule="auto"/>
+              <w:jc w:val="center"/>
+            </w:pPr>
+            <w:r/>
+            <w:r>
+              <w:rPr>
+                <w:rFonts w:ascii="Arial" w:hAnsi="Arial"/>
+                <w:b w:val="0"/>
+                <w:sz w:val="17"/>
+              </w:rPr>
+              <w:t>256</w:t>
+            </w:r>
+          </w:p>
+        </w:tc>
+        <w:tc>
+          <w:tcPr>
+            <w:tcW w:type="dxa" w:w="1999"/>
+            <w:shd w:fill="F5F7F9"/>
+            <w:vAlign w:val="center"/>
+            <w:tcMar>
+              <w:top w:w="90" w:type="dxa"/>
+              <w:start w:w="110" w:type="dxa"/>
+              <w:bottom w:w="90" w:type="dxa"/>
+              <w:end w:w="110" w:type="dxa"/>
+            </w:tcMar>
+            <w:tcBorders>
+              <w:top w:val="single" w:sz="4" w:color="D9D9D9"/>
+              <w:left w:val="single" w:sz="4" w:color="D9D9D9"/>
+              <w:bottom w:val="single" w:sz="4" w:color="D9D9D9"/>
+              <w:right w:val="single" w:sz="4" w:color="D9D9D9"/>
+            </w:tcBorders>
+          </w:tcPr>
+          <w:p>
+            <w:pPr>
+              <w:spacing w:after="0" w:line="252" w:lineRule="auto"/>
+              <w:jc w:val="left"/>
+            </w:pPr>
+            <w:r/>
+            <w:r>
+              <w:rPr>
+                <w:rFonts w:ascii="Arial" w:hAnsi="Arial"/>
+                <w:b w:val="0"/>
+                <w:sz w:val="17"/>
+              </w:rPr>
+              <w:t>Final hidden state</w:t>
+            </w:r>
+          </w:p>
+        </w:tc>
+        <w:tc>
+          <w:tcPr>
+            <w:tcW w:type="dxa" w:w="1999"/>
+            <w:shd w:fill="F5F7F9"/>
+            <w:vAlign w:val="center"/>
+            <w:tcMar>
+              <w:top w:w="90" w:type="dxa"/>
+              <w:start w:w="110" w:type="dxa"/>
+              <w:bottom w:w="90" w:type="dxa"/>
+              <w:end w:w="110" w:type="dxa"/>
+            </w:tcMar>
+            <w:tcBorders>
+              <w:top w:val="single" w:sz="4" w:color="D9D9D9"/>
+              <w:left w:val="single" w:sz="4" w:color="D9D9D9"/>
+              <w:bottom w:val="single" w:sz="4" w:color="D9D9D9"/>
+              <w:right w:val="single" w:sz="4" w:color="D9D9D9"/>
+            </w:tcBorders>
+          </w:tcPr>
+          <w:p>
+            <w:pPr>
+              <w:spacing w:after="0" w:line="252" w:lineRule="auto"/>
+              <w:jc w:val="center"/>
+            </w:pPr>
+            <w:r/>
+            <w:r>
+              <w:rPr>
+                <w:rFonts w:ascii="Arial" w:hAnsi="Arial"/>
+                <w:b w:val="0"/>
+                <w:sz w:val="17"/>
+              </w:rPr>
+              <w:t>4.15M</w:t>
+            </w:r>
+          </w:p>
+        </w:tc>
+      </w:tr>
+    </w:tbl>
+    <w:p>
+      <w:pPr>
+        <w:pStyle w:val="Heading1"/>
+        <w:keepNext/>
+      </w:pPr>
+      <w:r>
+        <w:t>4 Experimental protocol</w:t>
+      </w:r>
+    </w:p>
+    <w:p>
+      <w:pPr>
+        <w:spacing w:after="120" w:line="269" w:lineRule="auto"/>
+      </w:pPr>
+      <w:r>
+        <w:rPr>
+          <w:rFonts w:ascii="Arial" w:hAnsi="Arial"/>
+          <w:sz w:val="21"/>
+        </w:rPr>
+        <w:t>The models used Adam with a learning rate of 0.001, batch size 512, context length 64, and random seed 42. Training was capped at 40 epochs. Validation-loss early stopping used a patience of five epochs, and the lowest-validation-loss checkpoint was retained. The final checkpoint for each model was evaluated once on the held-out test set. Because early stopping is part of the protocol, models trained for different numbers of epochs; the comparison uses each model's best validated checkpoint rather than its final epoch.</w:t>
+      </w:r>
+    </w:p>
+    <w:p>
+      <w:pPr>
+        <w:pStyle w:val="Heading1"/>
+        <w:keepNext/>
+      </w:pPr>
+      <w:r>
+        <w:t>5 Training behaviour</w:t>
+      </w:r>
+    </w:p>
+    <w:p>
+      <w:pPr>
+        <w:spacing w:after="120" w:line="269" w:lineRule="auto"/>
+      </w:pPr>
+      <w:r>
+        <w:rPr>
+          <w:rFonts w:ascii="Arial" w:hAnsi="Arial"/>
+          <w:sz w:val="21"/>
+        </w:rPr>
+        <w:t>The learning curves show that LSTM and GRU reached lower validation loss than the two vanilla recurrent models. Simple RNN stopped after 22 epochs with its best checkpoint at epoch 17. BiRNN stopped after 33 epochs with its best checkpoint at epoch 28. LSTM stopped after 26 epochs with its best checkpoint at epoch 21. GRU reached the 40-epoch cap and its best checkpoint was the last epoch, indicating that it had not triggered early stopping.</w:t>
+      </w:r>
+    </w:p>
+    <w:p>
+      <w:pPr>
+        <w:keepNext/>
+        <w:spacing w:before="80" w:after="0"/>
+        <w:jc w:val="center"/>
+      </w:pPr>
+      <w:r>
+        <w:drawing>
+          <wp:inline xmlns:a="http://schemas.openxmlformats.org/drawingml/2006/main" xmlns:pic="http://schemas.openxmlformats.org/drawingml/2006/picture">
+            <wp:extent cx="3794760" cy="2530156"/>
+            <wp:docPr id="1" name="Picture 1"/>
+            <wp:cNvGraphicFramePr>
+              <a:graphicFrameLocks noChangeAspect="1"/>
+            </wp:cNvGraphicFramePr>
+            <a:graphic>
+              <a:graphicData uri="http://schemas.openxmlformats.org/drawingml/2006/picture">
+                <pic:pic>
+                  <pic:nvPicPr>
+                    <pic:cNvPr id="0" name="learning_curves.png"/>
+                    <pic:cNvPicPr/>
+                  </pic:nvPicPr>
+                  <pic:blipFill>
+                    <a:blip r:embed="rId9"/>
+                    <a:stretch>
+                      <a:fillRect/>
+                    </a:stretch>
+                  </pic:blipFill>
+                  <pic:spPr>
+                    <a:xfrm>
+                      <a:off x="0" y="0"/>
+                      <a:ext cx="3794760" cy="2530156"/>
+                    </a:xfrm>
+                    <a:prstGeom prst="rect"/>
+                  </pic:spPr>
+                </pic:pic>
+              </a:graphicData>
+            </a:graphic>
+          </wp:inline>
+        </w:drawing>
+      </w:r>
+    </w:p>
+    <w:p>
+      <w:pPr>
+        <w:spacing w:before="40" w:after="180"/>
+        <w:jc w:val="center"/>
+      </w:pPr>
+      <w:r>
+        <w:rPr>
+          <w:rFonts w:ascii="Arial" w:hAnsi="Arial"/>
+          <w:i/>
+          <w:sz w:val="18"/>
+        </w:rPr>
+        <w:t>Figure 1  Training and validation loss for the final context length 64 runs</w:t>
+      </w:r>
+    </w:p>
+    <w:p>
+      <w:r>
+        <w:br w:type="page"/>
+      </w:r>
+    </w:p>
+    <w:p>
+      <w:pPr>
+        <w:pStyle w:val="Heading1"/>
+        <w:keepNext/>
+      </w:pPr>
+      <w:r>
+        <w:t>6 Held out test results</w:t>
+      </w:r>
+    </w:p>
+    <w:tbl>
+      <w:tblPr>
+        <w:tblW w:type="auto" w:w="0"/>
+        <w:jc w:val="center"/>
+        <w:tblLayout w:type="fixed"/>
+        <w:tblLook w:firstColumn="1" w:firstRow="1" w:lastColumn="0" w:lastRow="0" w:noHBand="0" w:noVBand="1" w:val="04A0"/>
+      </w:tblPr>
+      <w:tblGrid>
+        <w:gridCol w:w="1428"/>
+        <w:gridCol w:w="1428"/>
+        <w:gridCol w:w="1428"/>
+        <w:gridCol w:w="1428"/>
+        <w:gridCol w:w="1428"/>
+        <w:gridCol w:w="1428"/>
+        <w:gridCol w:w="1428"/>
+      </w:tblGrid>
+      <w:tr>
+        <w:trPr>
+          <w:tblHeader w:val="true"/>
+        </w:trPr>
+        <w:tc>
+          <w:tcPr>
+            <w:tcW w:type="dxa" w:w="1512"/>
+            <w:vAlign w:val="center"/>
+            <w:tcMar>
+              <w:top w:w="90" w:type="dxa"/>
+              <w:start w:w="110" w:type="dxa"/>
+              <w:bottom w:w="90" w:type="dxa"/>
+              <w:end w:w="110" w:type="dxa"/>
+            </w:tcMar>
             <w:tcBorders>
               <w:top w:val="single" w:sz="4" w:color="D9D9D9"/>
               <w:left w:val="single" w:sz="4" w:color="D9D9D9"/>
@@ -628,6 +1573,7 @@
           </w:tcPr>
           <w:p>
             <w:pPr>
+              <w:spacing w:after="0" w:line="252" w:lineRule="auto"/>
               <w:jc w:val="center"/>
             </w:pPr>
             <w:r/>
@@ -636,16 +1582,22 @@
                 <w:rFonts w:ascii="Arial" w:hAnsi="Arial"/>
                 <w:b/>
                 <w:color w:val="FFFFFF"/>
-                <w:sz w:val="18"/>
+                <w:sz w:val="16"/>
               </w:rPr>
-              <w:t>Top-5</w:t>
+              <w:t>Model</w:t>
             </w:r>
           </w:p>
         </w:tc>
         <w:tc>
           <w:tcPr>
-            <w:tcW w:type="dxa" w:w="1419"/>
+            <w:tcW w:type="dxa" w:w="1008"/>
             <w:vAlign w:val="center"/>
+            <w:tcMar>
+              <w:top w:w="90" w:type="dxa"/>
+              <w:start w:w="110" w:type="dxa"/>
+              <w:bottom w:w="90" w:type="dxa"/>
+              <w:end w:w="110" w:type="dxa"/>
+            </w:tcMar>
             <w:tcBorders>
               <w:top w:val="single" w:sz="4" w:color="D9D9D9"/>
               <w:left w:val="single" w:sz="4" w:color="D9D9D9"/>
@@ -656,6 +1608,7 @@
           </w:tcPr>
           <w:p>
             <w:pPr>
+              <w:spacing w:after="0" w:line="252" w:lineRule="auto"/>
               <w:jc w:val="center"/>
             </w:pPr>
             <w:r/>
@@ -664,7 +1617,182 @@
                 <w:rFonts w:ascii="Arial" w:hAnsi="Arial"/>
                 <w:b/>
                 <w:color w:val="FFFFFF"/>
-                <w:sz w:val="18"/>
+                <w:sz w:val="16"/>
+              </w:rPr>
+              <w:t>Epochs</w:t>
+            </w:r>
+          </w:p>
+        </w:tc>
+        <w:tc>
+          <w:tcPr>
+            <w:tcW w:type="dxa" w:w="1440"/>
+            <w:vAlign w:val="center"/>
+            <w:tcMar>
+              <w:top w:w="90" w:type="dxa"/>
+              <w:start w:w="110" w:type="dxa"/>
+              <w:bottom w:w="90" w:type="dxa"/>
+              <w:end w:w="110" w:type="dxa"/>
+            </w:tcMar>
+            <w:tcBorders>
+              <w:top w:val="single" w:sz="4" w:color="D9D9D9"/>
+              <w:left w:val="single" w:sz="4" w:color="D9D9D9"/>
+              <w:bottom w:val="single" w:sz="4" w:color="D9D9D9"/>
+              <w:right w:val="single" w:sz="4" w:color="D9D9D9"/>
+            </w:tcBorders>
+            <w:shd w:fill="1F4E78"/>
+          </w:tcPr>
+          <w:p>
+            <w:pPr>
+              <w:spacing w:after="0" w:line="252" w:lineRule="auto"/>
+              <w:jc w:val="center"/>
+            </w:pPr>
+            <w:r/>
+            <w:r>
+              <w:rPr>
+                <w:rFonts w:ascii="Arial" w:hAnsi="Arial"/>
+                <w:b/>
+                <w:color w:val="FFFFFF"/>
+                <w:sz w:val="16"/>
+              </w:rPr>
+              <w:t>Parameters</w:t>
+            </w:r>
+          </w:p>
+        </w:tc>
+        <w:tc>
+          <w:tcPr>
+            <w:tcW w:type="dxa" w:w="1224"/>
+            <w:vAlign w:val="center"/>
+            <w:tcMar>
+              <w:top w:w="90" w:type="dxa"/>
+              <w:start w:w="110" w:type="dxa"/>
+              <w:bottom w:w="90" w:type="dxa"/>
+              <w:end w:w="110" w:type="dxa"/>
+            </w:tcMar>
+            <w:tcBorders>
+              <w:top w:val="single" w:sz="4" w:color="D9D9D9"/>
+              <w:left w:val="single" w:sz="4" w:color="D9D9D9"/>
+              <w:bottom w:val="single" w:sz="4" w:color="D9D9D9"/>
+              <w:right w:val="single" w:sz="4" w:color="D9D9D9"/>
+            </w:tcBorders>
+            <w:shd w:fill="1F4E78"/>
+          </w:tcPr>
+          <w:p>
+            <w:pPr>
+              <w:spacing w:after="0" w:line="252" w:lineRule="auto"/>
+              <w:jc w:val="center"/>
+            </w:pPr>
+            <w:r/>
+            <w:r>
+              <w:rPr>
+                <w:rFonts w:ascii="Arial" w:hAnsi="Arial"/>
+                <w:b/>
+                <w:color w:val="FFFFFF"/>
+                <w:sz w:val="16"/>
+              </w:rPr>
+              <w:t>Test PPL</w:t>
+            </w:r>
+          </w:p>
+        </w:tc>
+        <w:tc>
+          <w:tcPr>
+            <w:tcW w:type="dxa" w:w="1123"/>
+            <w:vAlign w:val="center"/>
+            <w:tcMar>
+              <w:top w:w="90" w:type="dxa"/>
+              <w:start w:w="110" w:type="dxa"/>
+              <w:bottom w:w="90" w:type="dxa"/>
+              <w:end w:w="110" w:type="dxa"/>
+            </w:tcMar>
+            <w:tcBorders>
+              <w:top w:val="single" w:sz="4" w:color="D9D9D9"/>
+              <w:left w:val="single" w:sz="4" w:color="D9D9D9"/>
+              <w:bottom w:val="single" w:sz="4" w:color="D9D9D9"/>
+              <w:right w:val="single" w:sz="4" w:color="D9D9D9"/>
+            </w:tcBorders>
+            <w:shd w:fill="1F4E78"/>
+          </w:tcPr>
+          <w:p>
+            <w:pPr>
+              <w:spacing w:after="0" w:line="252" w:lineRule="auto"/>
+              <w:jc w:val="center"/>
+            </w:pPr>
+            <w:r/>
+            <w:r>
+              <w:rPr>
+                <w:rFonts w:ascii="Arial" w:hAnsi="Arial"/>
+                <w:b/>
+                <w:color w:val="FFFFFF"/>
+                <w:sz w:val="16"/>
+              </w:rPr>
+              <w:t>Top 1</w:t>
+            </w:r>
+          </w:p>
+        </w:tc>
+        <w:tc>
+          <w:tcPr>
+            <w:tcW w:type="dxa" w:w="1123"/>
+            <w:vAlign w:val="center"/>
+            <w:tcMar>
+              <w:top w:w="90" w:type="dxa"/>
+              <w:start w:w="110" w:type="dxa"/>
+              <w:bottom w:w="90" w:type="dxa"/>
+              <w:end w:w="110" w:type="dxa"/>
+            </w:tcMar>
+            <w:tcBorders>
+              <w:top w:val="single" w:sz="4" w:color="D9D9D9"/>
+              <w:left w:val="single" w:sz="4" w:color="D9D9D9"/>
+              <w:bottom w:val="single" w:sz="4" w:color="D9D9D9"/>
+              <w:right w:val="single" w:sz="4" w:color="D9D9D9"/>
+            </w:tcBorders>
+            <w:shd w:fill="1F4E78"/>
+          </w:tcPr>
+          <w:p>
+            <w:pPr>
+              <w:spacing w:after="0" w:line="252" w:lineRule="auto"/>
+              <w:jc w:val="center"/>
+            </w:pPr>
+            <w:r/>
+            <w:r>
+              <w:rPr>
+                <w:rFonts w:ascii="Arial" w:hAnsi="Arial"/>
+                <w:b/>
+                <w:color w:val="FFFFFF"/>
+                <w:sz w:val="16"/>
+              </w:rPr>
+              <w:t>Top 5</w:t>
+            </w:r>
+          </w:p>
+        </w:tc>
+        <w:tc>
+          <w:tcPr>
+            <w:tcW w:type="dxa" w:w="1368"/>
+            <w:vAlign w:val="center"/>
+            <w:tcMar>
+              <w:top w:w="90" w:type="dxa"/>
+              <w:start w:w="110" w:type="dxa"/>
+              <w:bottom w:w="90" w:type="dxa"/>
+              <w:end w:w="110" w:type="dxa"/>
+            </w:tcMar>
+            <w:tcBorders>
+              <w:top w:val="single" w:sz="4" w:color="D9D9D9"/>
+              <w:left w:val="single" w:sz="4" w:color="D9D9D9"/>
+              <w:bottom w:val="single" w:sz="4" w:color="D9D9D9"/>
+              <w:right w:val="single" w:sz="4" w:color="D9D9D9"/>
+            </w:tcBorders>
+            <w:shd w:fill="1F4E78"/>
+          </w:tcPr>
+          <w:p>
+            <w:pPr>
+              <w:spacing w:after="0" w:line="252" w:lineRule="auto"/>
+              <w:jc w:val="center"/>
+            </w:pPr>
+            <w:r/>
+            <w:r>
+              <w:rPr>
+                <w:rFonts w:ascii="Arial" w:hAnsi="Arial"/>
+                <w:b/>
+                <w:color w:val="FFFFFF"/>
+                <w:sz w:val="16"/>
               </w:rPr>
               <w:t>Time</w:t>
             </w:r>
@@ -674,8 +1802,14 @@
       <w:tr>
         <w:tc>
           <w:tcPr>
-            <w:tcW w:type="dxa" w:w="1419"/>
+            <w:tcW w:type="dxa" w:w="1428"/>
             <w:vAlign w:val="center"/>
+            <w:tcMar>
+              <w:top w:w="90" w:type="dxa"/>
+              <w:start w:w="110" w:type="dxa"/>
+              <w:bottom w:w="90" w:type="dxa"/>
+              <w:end w:w="110" w:type="dxa"/>
+            </w:tcMar>
             <w:tcBorders>
               <w:top w:val="single" w:sz="4" w:color="D9D9D9"/>
               <w:left w:val="single" w:sz="4" w:color="D9D9D9"/>
@@ -685,6 +1819,7 @@
           </w:tcPr>
           <w:p>
             <w:pPr>
+              <w:spacing w:after="0" w:line="252" w:lineRule="auto"/>
               <w:jc w:val="center"/>
             </w:pPr>
             <w:r/>
@@ -692,7 +1827,7 @@
               <w:rPr>
                 <w:rFonts w:ascii="Arial" w:hAnsi="Arial"/>
                 <w:b w:val="0"/>
-                <w:sz w:val="18"/>
+                <w:sz w:val="17"/>
               </w:rPr>
               <w:t>Simple RNN</w:t>
             </w:r>
@@ -700,8 +1835,14 @@
         </w:tc>
         <w:tc>
           <w:tcPr>
-            <w:tcW w:type="dxa" w:w="1419"/>
+            <w:tcW w:type="dxa" w:w="1428"/>
             <w:vAlign w:val="center"/>
+            <w:tcMar>
+              <w:top w:w="90" w:type="dxa"/>
+              <w:start w:w="110" w:type="dxa"/>
+              <w:bottom w:w="90" w:type="dxa"/>
+              <w:end w:w="110" w:type="dxa"/>
+            </w:tcMar>
             <w:tcBorders>
               <w:top w:val="single" w:sz="4" w:color="D9D9D9"/>
               <w:left w:val="single" w:sz="4" w:color="D9D9D9"/>
@@ -711,6 +1852,7 @@
           </w:tcPr>
           <w:p>
             <w:pPr>
+              <w:spacing w:after="0" w:line="252" w:lineRule="auto"/>
               <w:jc w:val="center"/>
             </w:pPr>
             <w:r/>
@@ -718,7 +1860,7 @@
               <w:rPr>
                 <w:rFonts w:ascii="Arial" w:hAnsi="Arial"/>
                 <w:b w:val="0"/>
-                <w:sz w:val="18"/>
+                <w:sz w:val="17"/>
               </w:rPr>
               <w:t>22</w:t>
             </w:r>
@@ -726,8 +1868,14 @@
         </w:tc>
         <w:tc>
           <w:tcPr>
-            <w:tcW w:type="dxa" w:w="1419"/>
+            <w:tcW w:type="dxa" w:w="1428"/>
             <w:vAlign w:val="center"/>
+            <w:tcMar>
+              <w:top w:w="90" w:type="dxa"/>
+              <w:start w:w="110" w:type="dxa"/>
+              <w:bottom w:w="90" w:type="dxa"/>
+              <w:end w:w="110" w:type="dxa"/>
+            </w:tcMar>
             <w:tcBorders>
               <w:top w:val="single" w:sz="4" w:color="D9D9D9"/>
               <w:left w:val="single" w:sz="4" w:color="D9D9D9"/>
@@ -737,6 +1885,7 @@
           </w:tcPr>
           <w:p>
             <w:pPr>
+              <w:spacing w:after="0" w:line="252" w:lineRule="auto"/>
               <w:jc w:val="center"/>
             </w:pPr>
             <w:r/>
@@ -744,7 +1893,7 @@
               <w:rPr>
                 <w:rFonts w:ascii="Arial" w:hAnsi="Arial"/>
                 <w:b w:val="0"/>
-                <w:sz w:val="18"/>
+                <w:sz w:val="17"/>
               </w:rPr>
               <w:t>3.95M</w:t>
             </w:r>
@@ -752,8 +1901,14 @@
         </w:tc>
         <w:tc>
           <w:tcPr>
-            <w:tcW w:type="dxa" w:w="1419"/>
+            <w:tcW w:type="dxa" w:w="1428"/>
             <w:vAlign w:val="center"/>
+            <w:tcMar>
+              <w:top w:w="90" w:type="dxa"/>
+              <w:start w:w="110" w:type="dxa"/>
+              <w:bottom w:w="90" w:type="dxa"/>
+              <w:end w:w="110" w:type="dxa"/>
+            </w:tcMar>
             <w:tcBorders>
               <w:top w:val="single" w:sz="4" w:color="D9D9D9"/>
               <w:left w:val="single" w:sz="4" w:color="D9D9D9"/>
@@ -763,6 +1918,7 @@
           </w:tcPr>
           <w:p>
             <w:pPr>
+              <w:spacing w:after="0" w:line="252" w:lineRule="auto"/>
               <w:jc w:val="center"/>
             </w:pPr>
             <w:r/>
@@ -770,7 +1926,7 @@
               <w:rPr>
                 <w:rFonts w:ascii="Arial" w:hAnsi="Arial"/>
                 <w:b w:val="0"/>
-                <w:sz w:val="18"/>
+                <w:sz w:val="17"/>
               </w:rPr>
               <w:t>62.79</w:t>
             </w:r>
@@ -778,8 +1934,14 @@
         </w:tc>
         <w:tc>
           <w:tcPr>
-            <w:tcW w:type="dxa" w:w="1419"/>
+            <w:tcW w:type="dxa" w:w="1428"/>
             <w:vAlign w:val="center"/>
+            <w:tcMar>
+              <w:top w:w="90" w:type="dxa"/>
+              <w:start w:w="110" w:type="dxa"/>
+              <w:bottom w:w="90" w:type="dxa"/>
+              <w:end w:w="110" w:type="dxa"/>
+            </w:tcMar>
             <w:tcBorders>
               <w:top w:val="single" w:sz="4" w:color="D9D9D9"/>
               <w:left w:val="single" w:sz="4" w:color="D9D9D9"/>
@@ -789,6 +1951,7 @@
           </w:tcPr>
           <w:p>
             <w:pPr>
+              <w:spacing w:after="0" w:line="252" w:lineRule="auto"/>
               <w:jc w:val="center"/>
             </w:pPr>
             <w:r/>
@@ -796,7 +1959,7 @@
               <w:rPr>
                 <w:rFonts w:ascii="Arial" w:hAnsi="Arial"/>
                 <w:b w:val="0"/>
-                <w:sz w:val="18"/>
+                <w:sz w:val="17"/>
               </w:rPr>
               <w:t>31.94%</w:t>
             </w:r>
@@ -804,8 +1967,14 @@
         </w:tc>
         <w:tc>
           <w:tcPr>
-            <w:tcW w:type="dxa" w:w="1419"/>
+            <w:tcW w:type="dxa" w:w="1428"/>
             <w:vAlign w:val="center"/>
+            <w:tcMar>
+              <w:top w:w="90" w:type="dxa"/>
+              <w:start w:w="110" w:type="dxa"/>
+              <w:bottom w:w="90" w:type="dxa"/>
+              <w:end w:w="110" w:type="dxa"/>
+            </w:tcMar>
             <w:tcBorders>
               <w:top w:val="single" w:sz="4" w:color="D9D9D9"/>
               <w:left w:val="single" w:sz="4" w:color="D9D9D9"/>
@@ -815,6 +1984,7 @@
           </w:tcPr>
           <w:p>
             <w:pPr>
+              <w:spacing w:after="0" w:line="252" w:lineRule="auto"/>
               <w:jc w:val="center"/>
             </w:pPr>
             <w:r/>
@@ -822,7 +1992,7 @@
               <w:rPr>
                 <w:rFonts w:ascii="Arial" w:hAnsi="Arial"/>
                 <w:b w:val="0"/>
-                <w:sz w:val="18"/>
+                <w:sz w:val="17"/>
               </w:rPr>
               <w:t>50.56%</w:t>
             </w:r>
@@ -830,8 +2000,14 @@
         </w:tc>
         <w:tc>
           <w:tcPr>
-            <w:tcW w:type="dxa" w:w="1419"/>
+            <w:tcW w:type="dxa" w:w="1428"/>
             <w:vAlign w:val="center"/>
+            <w:tcMar>
+              <w:top w:w="90" w:type="dxa"/>
+              <w:start w:w="110" w:type="dxa"/>
+              <w:bottom w:w="90" w:type="dxa"/>
+              <w:end w:w="110" w:type="dxa"/>
+            </w:tcMar>
             <w:tcBorders>
               <w:top w:val="single" w:sz="4" w:color="D9D9D9"/>
               <w:left w:val="single" w:sz="4" w:color="D9D9D9"/>
@@ -841,6 +2017,7 @@
           </w:tcPr>
           <w:p>
             <w:pPr>
+              <w:spacing w:after="0" w:line="252" w:lineRule="auto"/>
               <w:jc w:val="center"/>
             </w:pPr>
             <w:r/>
@@ -848,7 +2025,7 @@
               <w:rPr>
                 <w:rFonts w:ascii="Arial" w:hAnsi="Arial"/>
                 <w:b w:val="0"/>
-                <w:sz w:val="18"/>
+                <w:sz w:val="17"/>
               </w:rPr>
               <w:t>21.8 min</w:t>
             </w:r>
@@ -858,8 +2035,15 @@
       <w:tr>
         <w:tc>
           <w:tcPr>
-            <w:tcW w:type="dxa" w:w="1419"/>
+            <w:tcW w:type="dxa" w:w="1428"/>
+            <w:shd w:fill="F5F7F9"/>
             <w:vAlign w:val="center"/>
+            <w:tcMar>
+              <w:top w:w="90" w:type="dxa"/>
+              <w:start w:w="110" w:type="dxa"/>
+              <w:bottom w:w="90" w:type="dxa"/>
+              <w:end w:w="110" w:type="dxa"/>
+            </w:tcMar>
             <w:tcBorders>
               <w:top w:val="single" w:sz="4" w:color="D9D9D9"/>
               <w:left w:val="single" w:sz="4" w:color="D9D9D9"/>
@@ -869,6 +2053,7 @@
           </w:tcPr>
           <w:p>
             <w:pPr>
+              <w:spacing w:after="0" w:line="252" w:lineRule="auto"/>
               <w:jc w:val="center"/>
             </w:pPr>
             <w:r/>
@@ -876,7 +2061,7 @@
               <w:rPr>
                 <w:rFonts w:ascii="Arial" w:hAnsi="Arial"/>
                 <w:b w:val="0"/>
-                <w:sz w:val="18"/>
+                <w:sz w:val="17"/>
               </w:rPr>
               <w:t>BiRNN</w:t>
             </w:r>
@@ -884,8 +2069,15 @@
         </w:tc>
         <w:tc>
           <w:tcPr>
-            <w:tcW w:type="dxa" w:w="1419"/>
+            <w:tcW w:type="dxa" w:w="1428"/>
+            <w:shd w:fill="F5F7F9"/>
             <w:vAlign w:val="center"/>
+            <w:tcMar>
+              <w:top w:w="90" w:type="dxa"/>
+              <w:start w:w="110" w:type="dxa"/>
+              <w:bottom w:w="90" w:type="dxa"/>
+              <w:end w:w="110" w:type="dxa"/>
+            </w:tcMar>
             <w:tcBorders>
               <w:top w:val="single" w:sz="4" w:color="D9D9D9"/>
               <w:left w:val="single" w:sz="4" w:color="D9D9D9"/>
@@ -895,6 +2087,7 @@
           </w:tcPr>
           <w:p>
             <w:pPr>
+              <w:spacing w:after="0" w:line="252" w:lineRule="auto"/>
               <w:jc w:val="center"/>
             </w:pPr>
             <w:r/>
@@ -902,7 +2095,7 @@
               <w:rPr>
                 <w:rFonts w:ascii="Arial" w:hAnsi="Arial"/>
                 <w:b w:val="0"/>
-                <w:sz w:val="18"/>
+                <w:sz w:val="17"/>
               </w:rPr>
               <w:t>33</w:t>
             </w:r>
@@ -910,8 +2103,15 @@
         </w:tc>
         <w:tc>
           <w:tcPr>
-            <w:tcW w:type="dxa" w:w="1419"/>
+            <w:tcW w:type="dxa" w:w="1428"/>
+            <w:shd w:fill="F5F7F9"/>
             <w:vAlign w:val="center"/>
+            <w:tcMar>
+              <w:top w:w="90" w:type="dxa"/>
+              <w:start w:w="110" w:type="dxa"/>
+              <w:bottom w:w="90" w:type="dxa"/>
+              <w:end w:w="110" w:type="dxa"/>
+            </w:tcMar>
             <w:tcBorders>
               <w:top w:val="single" w:sz="4" w:color="D9D9D9"/>
               <w:left w:val="single" w:sz="4" w:color="D9D9D9"/>
@@ -921,6 +2121,7 @@
           </w:tcPr>
           <w:p>
             <w:pPr>
+              <w:spacing w:after="0" w:line="252" w:lineRule="auto"/>
               <w:jc w:val="center"/>
             </w:pPr>
             <w:r/>
@@ -928,7 +2129,7 @@
               <w:rPr>
                 <w:rFonts w:ascii="Arial" w:hAnsi="Arial"/>
                 <w:b w:val="0"/>
-                <w:sz w:val="18"/>
+                <w:sz w:val="17"/>
               </w:rPr>
               <w:t>6.61M</w:t>
             </w:r>
@@ -936,8 +2137,15 @@
         </w:tc>
         <w:tc>
           <w:tcPr>
-            <w:tcW w:type="dxa" w:w="1419"/>
+            <w:tcW w:type="dxa" w:w="1428"/>
+            <w:shd w:fill="F5F7F9"/>
             <w:vAlign w:val="center"/>
+            <w:tcMar>
+              <w:top w:w="90" w:type="dxa"/>
+              <w:start w:w="110" w:type="dxa"/>
+              <w:bottom w:w="90" w:type="dxa"/>
+              <w:end w:w="110" w:type="dxa"/>
+            </w:tcMar>
             <w:tcBorders>
               <w:top w:val="single" w:sz="4" w:color="D9D9D9"/>
               <w:left w:val="single" w:sz="4" w:color="D9D9D9"/>
@@ -947,6 +2155,7 @@
           </w:tcPr>
           <w:p>
             <w:pPr>
+              <w:spacing w:after="0" w:line="252" w:lineRule="auto"/>
               <w:jc w:val="center"/>
             </w:pPr>
             <w:r/>
@@ -954,7 +2163,7 @@
               <w:rPr>
                 <w:rFonts w:ascii="Arial" w:hAnsi="Arial"/>
                 <w:b w:val="0"/>
-                <w:sz w:val="18"/>
+                <w:sz w:val="17"/>
               </w:rPr>
               <w:t>62.81</w:t>
             </w:r>
@@ -962,8 +2171,15 @@
         </w:tc>
         <w:tc>
           <w:tcPr>
-            <w:tcW w:type="dxa" w:w="1419"/>
+            <w:tcW w:type="dxa" w:w="1428"/>
+            <w:shd w:fill="F5F7F9"/>
             <w:vAlign w:val="center"/>
+            <w:tcMar>
+              <w:top w:w="90" w:type="dxa"/>
+              <w:start w:w="110" w:type="dxa"/>
+              <w:bottom w:w="90" w:type="dxa"/>
+              <w:end w:w="110" w:type="dxa"/>
+            </w:tcMar>
             <w:tcBorders>
               <w:top w:val="single" w:sz="4" w:color="D9D9D9"/>
               <w:left w:val="single" w:sz="4" w:color="D9D9D9"/>
@@ -973,6 +2189,7 @@
           </w:tcPr>
           <w:p>
             <w:pPr>
+              <w:spacing w:after="0" w:line="252" w:lineRule="auto"/>
               <w:jc w:val="center"/>
             </w:pPr>
             <w:r/>
@@ -980,7 +2197,7 @@
               <w:rPr>
                 <w:rFonts w:ascii="Arial" w:hAnsi="Arial"/>
                 <w:b w:val="0"/>
-                <w:sz w:val="18"/>
+                <w:sz w:val="17"/>
               </w:rPr>
               <w:t>32.00%</w:t>
             </w:r>
@@ -988,8 +2205,15 @@
         </w:tc>
         <w:tc>
           <w:tcPr>
-            <w:tcW w:type="dxa" w:w="1419"/>
+            <w:tcW w:type="dxa" w:w="1428"/>
+            <w:shd w:fill="F5F7F9"/>
             <w:vAlign w:val="center"/>
+            <w:tcMar>
+              <w:top w:w="90" w:type="dxa"/>
+              <w:start w:w="110" w:type="dxa"/>
+              <w:bottom w:w="90" w:type="dxa"/>
+              <w:end w:w="110" w:type="dxa"/>
+            </w:tcMar>
             <w:tcBorders>
               <w:top w:val="single" w:sz="4" w:color="D9D9D9"/>
               <w:left w:val="single" w:sz="4" w:color="D9D9D9"/>
@@ -999,6 +2223,7 @@
           </w:tcPr>
           <w:p>
             <w:pPr>
+              <w:spacing w:after="0" w:line="252" w:lineRule="auto"/>
               <w:jc w:val="center"/>
             </w:pPr>
             <w:r/>
@@ -1006,7 +2231,7 @@
               <w:rPr>
                 <w:rFonts w:ascii="Arial" w:hAnsi="Arial"/>
                 <w:b w:val="0"/>
-                <w:sz w:val="18"/>
+                <w:sz w:val="17"/>
               </w:rPr>
               <w:t>50.61%</w:t>
             </w:r>
@@ -1014,8 +2239,15 @@
         </w:tc>
         <w:tc>
           <w:tcPr>
-            <w:tcW w:type="dxa" w:w="1419"/>
+            <w:tcW w:type="dxa" w:w="1428"/>
+            <w:shd w:fill="F5F7F9"/>
             <w:vAlign w:val="center"/>
+            <w:tcMar>
+              <w:top w:w="90" w:type="dxa"/>
+              <w:start w:w="110" w:type="dxa"/>
+              <w:bottom w:w="90" w:type="dxa"/>
+              <w:end w:w="110" w:type="dxa"/>
+            </w:tcMar>
             <w:tcBorders>
               <w:top w:val="single" w:sz="4" w:color="D9D9D9"/>
               <w:left w:val="single" w:sz="4" w:color="D9D9D9"/>
@@ -1025,6 +2257,7 @@
           </w:tcPr>
           <w:p>
             <w:pPr>
+              <w:spacing w:after="0" w:line="252" w:lineRule="auto"/>
               <w:jc w:val="center"/>
             </w:pPr>
             <w:r/>
@@ -1032,7 +2265,7 @@
               <w:rPr>
                 <w:rFonts w:ascii="Arial" w:hAnsi="Arial"/>
                 <w:b w:val="0"/>
-                <w:sz w:val="18"/>
+                <w:sz w:val="17"/>
               </w:rPr>
               <w:t>51.7 min</w:t>
             </w:r>
@@ -1042,8 +2275,14 @@
       <w:tr>
         <w:tc>
           <w:tcPr>
-            <w:tcW w:type="dxa" w:w="1419"/>
+            <w:tcW w:type="dxa" w:w="1428"/>
             <w:vAlign w:val="center"/>
+            <w:tcMar>
+              <w:top w:w="90" w:type="dxa"/>
+              <w:start w:w="110" w:type="dxa"/>
+              <w:bottom w:w="90" w:type="dxa"/>
+              <w:end w:w="110" w:type="dxa"/>
+            </w:tcMar>
             <w:tcBorders>
               <w:top w:val="single" w:sz="4" w:color="D9D9D9"/>
               <w:left w:val="single" w:sz="4" w:color="D9D9D9"/>
@@ -1053,6 +2292,7 @@
           </w:tcPr>
           <w:p>
             <w:pPr>
+              <w:spacing w:after="0" w:line="252" w:lineRule="auto"/>
               <w:jc w:val="center"/>
             </w:pPr>
             <w:r/>
@@ -1060,7 +2300,7 @@
               <w:rPr>
                 <w:rFonts w:ascii="Arial" w:hAnsi="Arial"/>
                 <w:b w:val="0"/>
-                <w:sz w:val="18"/>
+                <w:sz w:val="17"/>
               </w:rPr>
               <w:t>LSTM</w:t>
             </w:r>
@@ -1068,8 +2308,14 @@
         </w:tc>
         <w:tc>
           <w:tcPr>
-            <w:tcW w:type="dxa" w:w="1419"/>
+            <w:tcW w:type="dxa" w:w="1428"/>
             <w:vAlign w:val="center"/>
+            <w:tcMar>
+              <w:top w:w="90" w:type="dxa"/>
+              <w:start w:w="110" w:type="dxa"/>
+              <w:bottom w:w="90" w:type="dxa"/>
+              <w:end w:w="110" w:type="dxa"/>
+            </w:tcMar>
             <w:tcBorders>
               <w:top w:val="single" w:sz="4" w:color="D9D9D9"/>
               <w:left w:val="single" w:sz="4" w:color="D9D9D9"/>
@@ -1079,6 +2325,7 @@
           </w:tcPr>
           <w:p>
             <w:pPr>
+              <w:spacing w:after="0" w:line="252" w:lineRule="auto"/>
               <w:jc w:val="center"/>
             </w:pPr>
             <w:r/>
@@ -1086,7 +2333,7 @@
               <w:rPr>
                 <w:rFonts w:ascii="Arial" w:hAnsi="Arial"/>
                 <w:b w:val="0"/>
-                <w:sz w:val="18"/>
+                <w:sz w:val="17"/>
               </w:rPr>
               <w:t>26</w:t>
             </w:r>
@@ -1094,8 +2341,14 @@
         </w:tc>
         <w:tc>
           <w:tcPr>
-            <w:tcW w:type="dxa" w:w="1419"/>
+            <w:tcW w:type="dxa" w:w="1428"/>
             <w:vAlign w:val="center"/>
+            <w:tcMar>
+              <w:top w:w="90" w:type="dxa"/>
+              <w:start w:w="110" w:type="dxa"/>
+              <w:bottom w:w="90" w:type="dxa"/>
+              <w:end w:w="110" w:type="dxa"/>
+            </w:tcMar>
             <w:tcBorders>
               <w:top w:val="single" w:sz="4" w:color="D9D9D9"/>
               <w:left w:val="single" w:sz="4" w:color="D9D9D9"/>
@@ -1105,6 +2358,7 @@
           </w:tcPr>
           <w:p>
             <w:pPr>
+              <w:spacing w:after="0" w:line="252" w:lineRule="auto"/>
               <w:jc w:val="center"/>
             </w:pPr>
             <w:r/>
@@ -1112,7 +2366,7 @@
               <w:rPr>
                 <w:rFonts w:ascii="Arial" w:hAnsi="Arial"/>
                 <w:b w:val="0"/>
-                <w:sz w:val="18"/>
+                <w:sz w:val="17"/>
               </w:rPr>
               <w:t>4.25M</w:t>
             </w:r>
@@ -1120,8 +2374,14 @@
         </w:tc>
         <w:tc>
           <w:tcPr>
-            <w:tcW w:type="dxa" w:w="1419"/>
+            <w:tcW w:type="dxa" w:w="1428"/>
             <w:vAlign w:val="center"/>
+            <w:tcMar>
+              <w:top w:w="90" w:type="dxa"/>
+              <w:start w:w="110" w:type="dxa"/>
+              <w:bottom w:w="90" w:type="dxa"/>
+              <w:end w:w="110" w:type="dxa"/>
+            </w:tcMar>
             <w:tcBorders>
               <w:top w:val="single" w:sz="4" w:color="D9D9D9"/>
               <w:left w:val="single" w:sz="4" w:color="D9D9D9"/>
@@ -1131,6 +2391,7 @@
           </w:tcPr>
           <w:p>
             <w:pPr>
+              <w:spacing w:after="0" w:line="252" w:lineRule="auto"/>
               <w:jc w:val="center"/>
             </w:pPr>
             <w:r/>
@@ -1138,7 +2399,7 @@
               <w:rPr>
                 <w:rFonts w:ascii="Arial" w:hAnsi="Arial"/>
                 <w:b w:val="0"/>
-                <w:sz w:val="18"/>
+                <w:sz w:val="17"/>
               </w:rPr>
               <w:t>50.03</w:t>
             </w:r>
@@ -1146,8 +2407,14 @@
         </w:tc>
         <w:tc>
           <w:tcPr>
-            <w:tcW w:type="dxa" w:w="1419"/>
+            <w:tcW w:type="dxa" w:w="1428"/>
             <w:vAlign w:val="center"/>
+            <w:tcMar>
+              <w:top w:w="90" w:type="dxa"/>
+              <w:start w:w="110" w:type="dxa"/>
+              <w:bottom w:w="90" w:type="dxa"/>
+              <w:end w:w="110" w:type="dxa"/>
+            </w:tcMar>
             <w:tcBorders>
               <w:top w:val="single" w:sz="4" w:color="D9D9D9"/>
               <w:left w:val="single" w:sz="4" w:color="D9D9D9"/>
@@ -1157,6 +2424,7 @@
           </w:tcPr>
           <w:p>
             <w:pPr>
+              <w:spacing w:after="0" w:line="252" w:lineRule="auto"/>
               <w:jc w:val="center"/>
             </w:pPr>
             <w:r/>
@@ -1164,7 +2432,7 @@
               <w:rPr>
                 <w:rFonts w:ascii="Arial" w:hAnsi="Arial"/>
                 <w:b w:val="0"/>
-                <w:sz w:val="18"/>
+                <w:sz w:val="17"/>
               </w:rPr>
               <w:t>34.14%</w:t>
             </w:r>
@@ -1172,8 +2440,14 @@
         </w:tc>
         <w:tc>
           <w:tcPr>
-            <w:tcW w:type="dxa" w:w="1419"/>
+            <w:tcW w:type="dxa" w:w="1428"/>
             <w:vAlign w:val="center"/>
+            <w:tcMar>
+              <w:top w:w="90" w:type="dxa"/>
+              <w:start w:w="110" w:type="dxa"/>
+              <w:bottom w:w="90" w:type="dxa"/>
+              <w:end w:w="110" w:type="dxa"/>
+            </w:tcMar>
             <w:tcBorders>
               <w:top w:val="single" w:sz="4" w:color="D9D9D9"/>
               <w:left w:val="single" w:sz="4" w:color="D9D9D9"/>
@@ -1183,6 +2457,7 @@
           </w:tcPr>
           <w:p>
             <w:pPr>
+              <w:spacing w:after="0" w:line="252" w:lineRule="auto"/>
               <w:jc w:val="center"/>
             </w:pPr>
             <w:r/>
@@ -1190,7 +2465,7 @@
               <w:rPr>
                 <w:rFonts w:ascii="Arial" w:hAnsi="Arial"/>
                 <w:b w:val="0"/>
-                <w:sz w:val="18"/>
+                <w:sz w:val="17"/>
               </w:rPr>
               <w:t>53.55%</w:t>
             </w:r>
@@ -1198,8 +2473,14 @@
         </w:tc>
         <w:tc>
           <w:tcPr>
-            <w:tcW w:type="dxa" w:w="1419"/>
+            <w:tcW w:type="dxa" w:w="1428"/>
             <w:vAlign w:val="center"/>
+            <w:tcMar>
+              <w:top w:w="90" w:type="dxa"/>
+              <w:start w:w="110" w:type="dxa"/>
+              <w:bottom w:w="90" w:type="dxa"/>
+              <w:end w:w="110" w:type="dxa"/>
+            </w:tcMar>
             <w:tcBorders>
               <w:top w:val="single" w:sz="4" w:color="D9D9D9"/>
               <w:left w:val="single" w:sz="4" w:color="D9D9D9"/>
@@ -1209,6 +2490,7 @@
           </w:tcPr>
           <w:p>
             <w:pPr>
+              <w:spacing w:after="0" w:line="252" w:lineRule="auto"/>
               <w:jc w:val="center"/>
             </w:pPr>
             <w:r/>
@@ -1216,7 +2498,7 @@
               <w:rPr>
                 <w:rFonts w:ascii="Arial" w:hAnsi="Arial"/>
                 <w:b w:val="0"/>
-                <w:sz w:val="18"/>
+                <w:sz w:val="17"/>
               </w:rPr>
               <w:t>29.9 min</w:t>
             </w:r>
@@ -1226,8 +2508,15 @@
       <w:tr>
         <w:tc>
           <w:tcPr>
-            <w:tcW w:type="dxa" w:w="1419"/>
+            <w:tcW w:type="dxa" w:w="1428"/>
+            <w:shd w:fill="F5F7F9"/>
             <w:vAlign w:val="center"/>
+            <w:tcMar>
+              <w:top w:w="90" w:type="dxa"/>
+              <w:start w:w="110" w:type="dxa"/>
+              <w:bottom w:w="90" w:type="dxa"/>
+              <w:end w:w="110" w:type="dxa"/>
+            </w:tcMar>
             <w:tcBorders>
               <w:top w:val="single" w:sz="4" w:color="D9D9D9"/>
               <w:left w:val="single" w:sz="4" w:color="D9D9D9"/>
@@ -1237,6 +2526,7 @@
           </w:tcPr>
           <w:p>
             <w:pPr>
+              <w:spacing w:after="0" w:line="252" w:lineRule="auto"/>
               <w:jc w:val="center"/>
             </w:pPr>
             <w:r/>
@@ -1244,7 +2534,7 @@
               <w:rPr>
                 <w:rFonts w:ascii="Arial" w:hAnsi="Arial"/>
                 <w:b w:val="0"/>
-                <w:sz w:val="18"/>
+                <w:sz w:val="17"/>
               </w:rPr>
               <w:t>GRU</w:t>
             </w:r>
@@ -1252,8 +2542,15 @@
         </w:tc>
         <w:tc>
           <w:tcPr>
-            <w:tcW w:type="dxa" w:w="1419"/>
+            <w:tcW w:type="dxa" w:w="1428"/>
+            <w:shd w:fill="F5F7F9"/>
             <w:vAlign w:val="center"/>
+            <w:tcMar>
+              <w:top w:w="90" w:type="dxa"/>
+              <w:start w:w="110" w:type="dxa"/>
+              <w:bottom w:w="90" w:type="dxa"/>
+              <w:end w:w="110" w:type="dxa"/>
+            </w:tcMar>
             <w:tcBorders>
               <w:top w:val="single" w:sz="4" w:color="D9D9D9"/>
               <w:left w:val="single" w:sz="4" w:color="D9D9D9"/>
@@ -1263,6 +2560,7 @@
           </w:tcPr>
           <w:p>
             <w:pPr>
+              <w:spacing w:after="0" w:line="252" w:lineRule="auto"/>
               <w:jc w:val="center"/>
             </w:pPr>
             <w:r/>
@@ -1270,7 +2568,7 @@
               <w:rPr>
                 <w:rFonts w:ascii="Arial" w:hAnsi="Arial"/>
                 <w:b w:val="0"/>
-                <w:sz w:val="18"/>
+                <w:sz w:val="17"/>
               </w:rPr>
               <w:t>40</w:t>
             </w:r>
@@ -1278,8 +2576,15 @@
         </w:tc>
         <w:tc>
           <w:tcPr>
-            <w:tcW w:type="dxa" w:w="1419"/>
+            <w:tcW w:type="dxa" w:w="1428"/>
+            <w:shd w:fill="F5F7F9"/>
             <w:vAlign w:val="center"/>
+            <w:tcMar>
+              <w:top w:w="90" w:type="dxa"/>
+              <w:start w:w="110" w:type="dxa"/>
+              <w:bottom w:w="90" w:type="dxa"/>
+              <w:end w:w="110" w:type="dxa"/>
+            </w:tcMar>
             <w:tcBorders>
               <w:top w:val="single" w:sz="4" w:color="D9D9D9"/>
               <w:left w:val="single" w:sz="4" w:color="D9D9D9"/>
@@ -1289,6 +2594,7 @@
           </w:tcPr>
           <w:p>
             <w:pPr>
+              <w:spacing w:after="0" w:line="252" w:lineRule="auto"/>
               <w:jc w:val="center"/>
             </w:pPr>
             <w:r/>
@@ -1296,7 +2602,7 @@
               <w:rPr>
                 <w:rFonts w:ascii="Arial" w:hAnsi="Arial"/>
                 <w:b w:val="0"/>
-                <w:sz w:val="18"/>
+                <w:sz w:val="17"/>
               </w:rPr>
               <w:t>4.15M</w:t>
             </w:r>
@@ -1304,8 +2610,15 @@
         </w:tc>
         <w:tc>
           <w:tcPr>
-            <w:tcW w:type="dxa" w:w="1419"/>
+            <w:tcW w:type="dxa" w:w="1428"/>
+            <w:shd w:fill="F5F7F9"/>
             <w:vAlign w:val="center"/>
+            <w:tcMar>
+              <w:top w:w="90" w:type="dxa"/>
+              <w:start w:w="110" w:type="dxa"/>
+              <w:bottom w:w="90" w:type="dxa"/>
+              <w:end w:w="110" w:type="dxa"/>
+            </w:tcMar>
             <w:tcBorders>
               <w:top w:val="single" w:sz="4" w:color="D9D9D9"/>
               <w:left w:val="single" w:sz="4" w:color="D9D9D9"/>
@@ -1315,6 +2628,7 @@
           </w:tcPr>
           <w:p>
             <w:pPr>
+              <w:spacing w:after="0" w:line="252" w:lineRule="auto"/>
               <w:jc w:val="center"/>
             </w:pPr>
             <w:r/>
@@ -1322,7 +2636,7 @@
               <w:rPr>
                 <w:rFonts w:ascii="Arial" w:hAnsi="Arial"/>
                 <w:b w:val="0"/>
-                <w:sz w:val="18"/>
+                <w:sz w:val="17"/>
               </w:rPr>
               <w:t>45.30</w:t>
             </w:r>
@@ -1330,8 +2644,15 @@
         </w:tc>
         <w:tc>
           <w:tcPr>
-            <w:tcW w:type="dxa" w:w="1419"/>
+            <w:tcW w:type="dxa" w:w="1428"/>
+            <w:shd w:fill="F5F7F9"/>
             <w:vAlign w:val="center"/>
+            <w:tcMar>
+              <w:top w:w="90" w:type="dxa"/>
+              <w:start w:w="110" w:type="dxa"/>
+              <w:bottom w:w="90" w:type="dxa"/>
+              <w:end w:w="110" w:type="dxa"/>
+            </w:tcMar>
             <w:tcBorders>
               <w:top w:val="single" w:sz="4" w:color="D9D9D9"/>
               <w:left w:val="single" w:sz="4" w:color="D9D9D9"/>
@@ -1341,6 +2662,7 @@
           </w:tcPr>
           <w:p>
             <w:pPr>
+              <w:spacing w:after="0" w:line="252" w:lineRule="auto"/>
               <w:jc w:val="center"/>
             </w:pPr>
             <w:r/>
@@ -1348,7 +2670,7 @@
               <w:rPr>
                 <w:rFonts w:ascii="Arial" w:hAnsi="Arial"/>
                 <w:b w:val="0"/>
-                <w:sz w:val="18"/>
+                <w:sz w:val="17"/>
               </w:rPr>
               <w:t>34.84%</w:t>
             </w:r>
@@ -1356,8 +2678,15 @@
         </w:tc>
         <w:tc>
           <w:tcPr>
-            <w:tcW w:type="dxa" w:w="1419"/>
+            <w:tcW w:type="dxa" w:w="1428"/>
+            <w:shd w:fill="F5F7F9"/>
             <w:vAlign w:val="center"/>
+            <w:tcMar>
+              <w:top w:w="90" w:type="dxa"/>
+              <w:start w:w="110" w:type="dxa"/>
+              <w:bottom w:w="90" w:type="dxa"/>
+              <w:end w:w="110" w:type="dxa"/>
+            </w:tcMar>
             <w:tcBorders>
               <w:top w:val="single" w:sz="4" w:color="D9D9D9"/>
               <w:left w:val="single" w:sz="4" w:color="D9D9D9"/>
@@ -1367,6 +2696,7 @@
           </w:tcPr>
           <w:p>
             <w:pPr>
+              <w:spacing w:after="0" w:line="252" w:lineRule="auto"/>
               <w:jc w:val="center"/>
             </w:pPr>
             <w:r/>
@@ -1374,7 +2704,7 @@
               <w:rPr>
                 <w:rFonts w:ascii="Arial" w:hAnsi="Arial"/>
                 <w:b w:val="0"/>
-                <w:sz w:val="18"/>
+                <w:sz w:val="17"/>
               </w:rPr>
               <w:t>54.79%</w:t>
             </w:r>
@@ -1382,8 +2712,15 @@
         </w:tc>
         <w:tc>
           <w:tcPr>
-            <w:tcW w:type="dxa" w:w="1419"/>
+            <w:tcW w:type="dxa" w:w="1428"/>
+            <w:shd w:fill="F5F7F9"/>
             <w:vAlign w:val="center"/>
+            <w:tcMar>
+              <w:top w:w="90" w:type="dxa"/>
+              <w:start w:w="110" w:type="dxa"/>
+              <w:bottom w:w="90" w:type="dxa"/>
+              <w:end w:w="110" w:type="dxa"/>
+            </w:tcMar>
             <w:tcBorders>
               <w:top w:val="single" w:sz="4" w:color="D9D9D9"/>
               <w:left w:val="single" w:sz="4" w:color="D9D9D9"/>
@@ -1393,6 +2730,7 @@
           </w:tcPr>
           <w:p>
             <w:pPr>
+              <w:spacing w:after="0" w:line="252" w:lineRule="auto"/>
               <w:jc w:val="center"/>
             </w:pPr>
             <w:r/>
@@ -1400,7 +2738,7 @@
               <w:rPr>
                 <w:rFonts w:ascii="Arial" w:hAnsi="Arial"/>
                 <w:b w:val="0"/>
-                <w:sz w:val="18"/>
+                <w:sz w:val="17"/>
               </w:rPr>
               <w:t>47.0 min</w:t>
             </w:r>
@@ -1410,111 +2748,1227 @@
     </w:tbl>
     <w:p>
       <w:pPr>
-        <w:spacing w:after="140" w:line="269" w:lineRule="auto"/>
+        <w:spacing w:after="120" w:line="269" w:lineRule="auto"/>
       </w:pPr>
       <w:r>
         <w:rPr>
           <w:rFonts w:ascii="Arial" w:hAnsi="Arial"/>
           <w:sz w:val="21"/>
         </w:rPr>
-        <w:t>The gated models substantially outperformed the vanilla recurrent models. GRU obtained the lowest test perplexity (45.30) and highest top-1 and top-5 accuracies. BiRNN used the most parameters and the most time but was effectively tied with the smaller Simple RNN on test perplexity.</w:t>
+        <w:t>GRU achieved the strongest predictive result. Its perplexity of 45.30 was 9.5% lower than LSTM and about 27.9% lower than Simple RNN. It also obtained the highest top-1 accuracy at 34.84% and top-5 accuracy at 54.79%. LSTM was the best time-quality compromise: it improved substantially on both vanilla models while training 17.1 minutes faster than GRU. BiRNN increased parameter count and training time without improving perplexity over Simple RNN.</w:t>
+      </w:r>
+    </w:p>
+    <w:p>
+      <w:pPr>
+        <w:keepNext/>
+        <w:spacing w:before="80" w:after="0"/>
+        <w:jc w:val="center"/>
+      </w:pPr>
+      <w:r>
+        <w:drawing>
+          <wp:inline xmlns:a="http://schemas.openxmlformats.org/drawingml/2006/main" xmlns:pic="http://schemas.openxmlformats.org/drawingml/2006/picture">
+            <wp:extent cx="6080760" cy="1994816"/>
+            <wp:docPr id="2" name="Picture 2"/>
+            <wp:cNvGraphicFramePr>
+              <a:graphicFrameLocks noChangeAspect="1"/>
+            </wp:cNvGraphicFramePr>
+            <a:graphic>
+              <a:graphicData uri="http://schemas.openxmlformats.org/drawingml/2006/picture">
+                <pic:pic>
+                  <pic:nvPicPr>
+                    <pic:cNvPr id="0" name="test_metrics.png"/>
+                    <pic:cNvPicPr/>
+                  </pic:nvPicPr>
+                  <pic:blipFill>
+                    <a:blip r:embed="rId10"/>
+                    <a:stretch>
+                      <a:fillRect/>
+                    </a:stretch>
+                  </pic:blipFill>
+                  <pic:spPr>
+                    <a:xfrm>
+                      <a:off x="0" y="0"/>
+                      <a:ext cx="6080760" cy="1994816"/>
+                    </a:xfrm>
+                    <a:prstGeom prst="rect"/>
+                  </pic:spPr>
+                </pic:pic>
+              </a:graphicData>
+            </a:graphic>
+          </wp:inline>
+        </w:drawing>
+      </w:r>
+    </w:p>
+    <w:p>
+      <w:pPr>
+        <w:spacing w:before="40" w:after="180"/>
+        <w:jc w:val="center"/>
+      </w:pPr>
+      <w:r>
+        <w:rPr>
+          <w:rFonts w:ascii="Arial" w:hAnsi="Arial"/>
+          <w:i/>
+          <w:sz w:val="18"/>
+        </w:rPr>
+        <w:t>Figure 2  Held-out perplexity and next-word accuracy</w:t>
       </w:r>
     </w:p>
     <w:p>
       <w:pPr>
         <w:pStyle w:val="Heading1"/>
+        <w:keepNext/>
       </w:pPr>
       <w:r>
-        <w:t>5 Temperature study and qualitative evaluation</w:t>
+        <w:t>7 Generation sweep</w:t>
       </w:r>
     </w:p>
     <w:p>
       <w:pPr>
-        <w:spacing w:after="140" w:line="269" w:lineRule="auto"/>
+        <w:spacing w:after="120" w:line="269" w:lineRule="auto"/>
       </w:pPr>
       <w:r>
         <w:rPr>
           <w:rFonts w:ascii="Arial" w:hAnsi="Arial"/>
           <w:sz w:val="21"/>
         </w:rPr>
-        <w:t>A reproducible sweep generated 7,200 poems: four models, six temperatures (0.3, 0.5, 0.8, 1.0, 1.3, and 1.5), and 300 poems per model-temperature cell. All models used the same five seed prompts. Automatic evaluation measured termination, exact five-line form, CMU Pronouncing Dictionary coverage, an AABBA rhyme score, repeated trigrams, immediate word repetitions, copied training lines, distinct n-grams, and unique-poem share. Bootstrap percentile intervals used 2,000 resamples.</w:t>
+        <w:t>The generation sweep produced 7,200 poems from four models, six temperatures, and 300 poems per model-temperature cell. All models used the same five prompts. Automatic metrics covered termination, exact five-line form, pronunciation-dictionary coverage, AABBA rhyme, repeated trigrams, immediate repetitions, copied training lines, distinct n-grams, and unique-poem share. Metric uncertainty was estimated with 2,000 bootstrap resamples.</w:t>
       </w:r>
     </w:p>
     <w:p>
       <w:pPr>
-        <w:spacing w:after="140" w:line="269" w:lineRule="auto"/>
+        <w:spacing w:after="120" w:line="269" w:lineRule="auto"/>
       </w:pPr>
       <w:r>
         <w:rPr>
           <w:rFonts w:ascii="Arial" w:hAnsi="Arial"/>
           <w:sz w:val="21"/>
         </w:rPr>
-        <w:t>The expected trade-off appeared clearly. Increasing temperature increased lexical diversity but reduced adherence to limerick form and rhyme. At temperature 0.3, GRU generated exactly five lines for 100% of samples and obtained the strongest AABBA rhyme score (46.7%). The held-out human reference row had an approximately 99.9% rhyme score, showing that all neural models remained substantially below the source-text form quality.</w:t>
+        <w:t>Temperature controlled a clear structure-diversity trade-off. Higher values increased lexical diversity but reduced five-line form and rhyme adherence. At temperature 0.3, GRU generated exactly five lines for 100% of samples and obtained the strongest AABBA rhyme score at 46.7%. The held-out human reference had an approximately 99.9% rhyme score, so the automatic result should be read as the best among the trained models rather than human-level poetic form.</w:t>
+      </w:r>
+    </w:p>
+    <w:p>
+      <w:r>
+        <w:br w:type="page"/>
       </w:r>
     </w:p>
     <w:p>
       <w:pPr>
         <w:pStyle w:val="Heading1"/>
+        <w:keepNext/>
       </w:pPr>
       <w:r>
-        <w:t>6 Blinded manual scoring</w:t>
+        <w:t>8 Temperature effects</w:t>
       </w:r>
     </w:p>
     <w:p>
       <w:pPr>
-        <w:spacing w:after="140" w:line="269" w:lineRule="auto"/>
+        <w:keepNext/>
+        <w:spacing w:before="80" w:after="0"/>
+        <w:jc w:val="center"/>
+      </w:pPr>
+      <w:r>
+        <w:drawing>
+          <wp:inline xmlns:a="http://schemas.openxmlformats.org/drawingml/2006/main" xmlns:pic="http://schemas.openxmlformats.org/drawingml/2006/picture">
+            <wp:extent cx="5166360" cy="3444671"/>
+            <wp:docPr id="3" name="Picture 3"/>
+            <wp:cNvGraphicFramePr>
+              <a:graphicFrameLocks noChangeAspect="1"/>
+            </wp:cNvGraphicFramePr>
+            <a:graphic>
+              <a:graphicData uri="http://schemas.openxmlformats.org/drawingml/2006/picture">
+                <pic:pic>
+                  <pic:nvPicPr>
+                    <pic:cNvPr id="0" name="temperature_effects.png"/>
+                    <pic:cNvPicPr/>
+                  </pic:nvPicPr>
+                  <pic:blipFill>
+                    <a:blip r:embed="rId11"/>
+                    <a:stretch>
+                      <a:fillRect/>
+                    </a:stretch>
+                  </pic:blipFill>
+                  <pic:spPr>
+                    <a:xfrm>
+                      <a:off x="0" y="0"/>
+                      <a:ext cx="5166360" cy="3444671"/>
+                    </a:xfrm>
+                    <a:prstGeom prst="rect"/>
+                  </pic:spPr>
+                </pic:pic>
+              </a:graphicData>
+            </a:graphic>
+          </wp:inline>
+        </w:drawing>
+      </w:r>
+    </w:p>
+    <w:p>
+      <w:pPr>
+        <w:spacing w:before="40" w:after="180"/>
+        <w:jc w:val="center"/>
+      </w:pPr>
+      <w:r>
+        <w:rPr>
+          <w:rFonts w:ascii="Arial" w:hAnsi="Arial"/>
+          <w:i/>
+          <w:sz w:val="18"/>
+        </w:rPr>
+        <w:t>Figure 3  Form quality and diversity across sampling temperatures</w:t>
+      </w:r>
+    </w:p>
+    <w:p>
+      <w:pPr>
+        <w:spacing w:after="120" w:line="269" w:lineRule="auto"/>
       </w:pPr>
       <w:r>
         <w:rPr>
           <w:rFonts w:ascii="Arial" w:hAnsi="Arial"/>
           <w:sz w:val="21"/>
         </w:rPr>
-        <w:t>A blinded manual sample contained 80 poems: four models, four temperatures, and five poems per cell. Poems were rated from 1 to 5 for coherence and contextual consistency without revealing the model or temperature. GRU at temperature 0.3 had the strongest combined manual score (3.0/5, 95% bootstrap CI 2.6-3.4), tied in point estimate with LSTM at temperature 0.3. GRU had better contextual consistency (3.4/5) and much stronger automatic rhyme evidence. At high temperature, manual scores deteriorated for every model.</w:t>
+        <w:t>Low-temperature decoding repeatedly selected high-probability words and therefore preserved structure more reliably. As temperature increased, the distribution flattened and the models selected more varied tokens. This improved distinct n-gram measures, but it also increased malformed line endings and weakened rhyme. Temperature 0.3 is appropriate for the assignment's structured limerick objective; temperatures from 0.8 to 1.0 are more suitable when variety matters more than consistent form.</w:t>
       </w:r>
     </w:p>
     <w:p>
       <w:pPr>
         <w:pStyle w:val="Heading1"/>
+        <w:keepNext/>
       </w:pPr>
       <w:r>
-        <w:t>7 Conclusion</w:t>
+        <w:t>9 Blinded manual evaluation</w:t>
       </w:r>
     </w:p>
     <w:p>
       <w:pPr>
-        <w:spacing w:after="140" w:line="269" w:lineRule="auto"/>
+        <w:spacing w:after="120" w:line="269" w:lineRule="auto"/>
       </w:pPr>
       <w:r>
         <w:rPr>
           <w:rFonts w:ascii="Arial" w:hAnsi="Arial"/>
           <w:sz w:val="21"/>
         </w:rPr>
-        <w:t>GRU at temperature 0.3 is the most effective configuration for this dataset. It combines the best next-word prediction metrics, reliable five-line termination, the highest automatic rhyme adherence, and the strongest contextual-consistency rating. Lower temperature is preferable for structured limerick generation because it preserves form, although it reduces diversity.</w:t>
+        <w:t>The blinded sheet contained 80 poems: four models, four temperatures, and five poems per cell. The rater scored coherence and contextual consistency from 1 to 5 without seeing model or temperature labels. GRU at temperature 0.3 achieved a combined score of 3.0 out of 5 with a 95% bootstrap interval of 2.6 to 3.4. LSTM at temperature 0.3 had the same combined point estimate, but GRU had a higher contextual-consistency score at 3.4 and stronger automatic rhyme evidence. Manual scores fell at high temperature for every model.</w:t>
+      </w:r>
+    </w:p>
+    <w:p>
+      <w:pPr>
+        <w:keepNext/>
+        <w:spacing w:before="80" w:after="0"/>
+        <w:jc w:val="center"/>
+      </w:pPr>
+      <w:r>
+        <w:drawing>
+          <wp:inline xmlns:a="http://schemas.openxmlformats.org/drawingml/2006/main" xmlns:pic="http://schemas.openxmlformats.org/drawingml/2006/picture">
+            <wp:extent cx="3474720" cy="2405575"/>
+            <wp:docPr id="4" name="Picture 4"/>
+            <wp:cNvGraphicFramePr>
+              <a:graphicFrameLocks noChangeAspect="1"/>
+            </wp:cNvGraphicFramePr>
+            <a:graphic>
+              <a:graphicData uri="http://schemas.openxmlformats.org/drawingml/2006/picture">
+                <pic:pic>
+                  <pic:nvPicPr>
+                    <pic:cNvPr id="0" name="manual_score_results.png"/>
+                    <pic:cNvPicPr/>
+                  </pic:nvPicPr>
+                  <pic:blipFill>
+                    <a:blip r:embed="rId12"/>
+                    <a:stretch>
+                      <a:fillRect/>
+                    </a:stretch>
+                  </pic:blipFill>
+                  <pic:spPr>
+                    <a:xfrm>
+                      <a:off x="0" y="0"/>
+                      <a:ext cx="3474720" cy="2405575"/>
+                    </a:xfrm>
+                    <a:prstGeom prst="rect"/>
+                  </pic:spPr>
+                </pic:pic>
+              </a:graphicData>
+            </a:graphic>
+          </wp:inline>
+        </w:drawing>
+      </w:r>
+    </w:p>
+    <w:p>
+      <w:pPr>
+        <w:spacing w:before="40" w:after="180"/>
+        <w:jc w:val="center"/>
+      </w:pPr>
+      <w:r>
+        <w:rPr>
+          <w:rFonts w:ascii="Arial" w:hAnsi="Arial"/>
+          <w:i/>
+          <w:sz w:val="18"/>
+        </w:rPr>
+        <w:t>Figure 4  Mean blinded manual scores by model and temperature</w:t>
       </w:r>
     </w:p>
     <w:p>
       <w:pPr>
         <w:pStyle w:val="Heading1"/>
+        <w:keepNext/>
       </w:pPr>
       <w:r>
-        <w:t>8 Limitations</w:t>
+        <w:t>10 Model selection</w:t>
       </w:r>
     </w:p>
+    <w:tbl>
+      <w:tblPr>
+        <w:tblW w:type="auto" w:w="0"/>
+        <w:jc w:val="center"/>
+        <w:tblLayout w:type="fixed"/>
+        <w:tblLook w:firstColumn="1" w:firstRow="1" w:lastColumn="0" w:lastRow="0" w:noHBand="0" w:noVBand="1" w:val="04A0"/>
+      </w:tblPr>
+      <w:tblGrid>
+        <w:gridCol w:w="1999"/>
+        <w:gridCol w:w="1999"/>
+        <w:gridCol w:w="1999"/>
+        <w:gridCol w:w="1999"/>
+        <w:gridCol w:w="1999"/>
+      </w:tblGrid>
+      <w:tr>
+        <w:trPr>
+          <w:tblHeader w:val="true"/>
+        </w:trPr>
+        <w:tc>
+          <w:tcPr>
+            <w:tcW w:type="dxa" w:w="1440"/>
+            <w:vAlign w:val="center"/>
+            <w:tcMar>
+              <w:top w:w="90" w:type="dxa"/>
+              <w:start w:w="110" w:type="dxa"/>
+              <w:bottom w:w="90" w:type="dxa"/>
+              <w:end w:w="110" w:type="dxa"/>
+            </w:tcMar>
+            <w:tcBorders>
+              <w:top w:val="single" w:sz="4" w:color="D9D9D9"/>
+              <w:left w:val="single" w:sz="4" w:color="D9D9D9"/>
+              <w:bottom w:val="single" w:sz="4" w:color="D9D9D9"/>
+              <w:right w:val="single" w:sz="4" w:color="D9D9D9"/>
+            </w:tcBorders>
+            <w:shd w:fill="1F4E78"/>
+          </w:tcPr>
+          <w:p>
+            <w:pPr>
+              <w:spacing w:after="0" w:line="252" w:lineRule="auto"/>
+              <w:jc w:val="center"/>
+            </w:pPr>
+            <w:r/>
+            <w:r>
+              <w:rPr>
+                <w:rFonts w:ascii="Arial" w:hAnsi="Arial"/>
+                <w:b/>
+                <w:color w:val="FFFFFF"/>
+                <w:sz w:val="16"/>
+              </w:rPr>
+              <w:t>Model</w:t>
+            </w:r>
+          </w:p>
+        </w:tc>
+        <w:tc>
+          <w:tcPr>
+            <w:tcW w:type="dxa" w:w="1800"/>
+            <w:vAlign w:val="center"/>
+            <w:tcMar>
+              <w:top w:w="90" w:type="dxa"/>
+              <w:start w:w="110" w:type="dxa"/>
+              <w:bottom w:w="90" w:type="dxa"/>
+              <w:end w:w="110" w:type="dxa"/>
+            </w:tcMar>
+            <w:tcBorders>
+              <w:top w:val="single" w:sz="4" w:color="D9D9D9"/>
+              <w:left w:val="single" w:sz="4" w:color="D9D9D9"/>
+              <w:bottom w:val="single" w:sz="4" w:color="D9D9D9"/>
+              <w:right w:val="single" w:sz="4" w:color="D9D9D9"/>
+            </w:tcBorders>
+            <w:shd w:fill="1F4E78"/>
+          </w:tcPr>
+          <w:p>
+            <w:pPr>
+              <w:spacing w:after="0" w:line="252" w:lineRule="auto"/>
+              <w:jc w:val="center"/>
+            </w:pPr>
+            <w:r/>
+            <w:r>
+              <w:rPr>
+                <w:rFonts w:ascii="Arial" w:hAnsi="Arial"/>
+                <w:b/>
+                <w:color w:val="FFFFFF"/>
+                <w:sz w:val="16"/>
+              </w:rPr>
+              <w:t>Prediction</w:t>
+            </w:r>
+          </w:p>
+        </w:tc>
+        <w:tc>
+          <w:tcPr>
+            <w:tcW w:type="dxa" w:w="1944"/>
+            <w:vAlign w:val="center"/>
+            <w:tcMar>
+              <w:top w:w="90" w:type="dxa"/>
+              <w:start w:w="110" w:type="dxa"/>
+              <w:bottom w:w="90" w:type="dxa"/>
+              <w:end w:w="110" w:type="dxa"/>
+            </w:tcMar>
+            <w:tcBorders>
+              <w:top w:val="single" w:sz="4" w:color="D9D9D9"/>
+              <w:left w:val="single" w:sz="4" w:color="D9D9D9"/>
+              <w:bottom w:val="single" w:sz="4" w:color="D9D9D9"/>
+              <w:right w:val="single" w:sz="4" w:color="D9D9D9"/>
+            </w:tcBorders>
+            <w:shd w:fill="1F4E78"/>
+          </w:tcPr>
+          <w:p>
+            <w:pPr>
+              <w:spacing w:after="0" w:line="252" w:lineRule="auto"/>
+              <w:jc w:val="center"/>
+            </w:pPr>
+            <w:r/>
+            <w:r>
+              <w:rPr>
+                <w:rFonts w:ascii="Arial" w:hAnsi="Arial"/>
+                <w:b/>
+                <w:color w:val="FFFFFF"/>
+                <w:sz w:val="16"/>
+              </w:rPr>
+              <w:t>Training cost</w:t>
+            </w:r>
+          </w:p>
+        </w:tc>
+        <w:tc>
+          <w:tcPr>
+            <w:tcW w:type="dxa" w:w="2088"/>
+            <w:vAlign w:val="center"/>
+            <w:tcMar>
+              <w:top w:w="90" w:type="dxa"/>
+              <w:start w:w="110" w:type="dxa"/>
+              <w:bottom w:w="90" w:type="dxa"/>
+              <w:end w:w="110" w:type="dxa"/>
+            </w:tcMar>
+            <w:tcBorders>
+              <w:top w:val="single" w:sz="4" w:color="D9D9D9"/>
+              <w:left w:val="single" w:sz="4" w:color="D9D9D9"/>
+              <w:bottom w:val="single" w:sz="4" w:color="D9D9D9"/>
+              <w:right w:val="single" w:sz="4" w:color="D9D9D9"/>
+            </w:tcBorders>
+            <w:shd w:fill="1F4E78"/>
+          </w:tcPr>
+          <w:p>
+            <w:pPr>
+              <w:spacing w:after="0" w:line="252" w:lineRule="auto"/>
+              <w:jc w:val="center"/>
+            </w:pPr>
+            <w:r/>
+            <w:r>
+              <w:rPr>
+                <w:rFonts w:ascii="Arial" w:hAnsi="Arial"/>
+                <w:b/>
+                <w:color w:val="FFFFFF"/>
+                <w:sz w:val="16"/>
+              </w:rPr>
+              <w:t>Generated form</w:t>
+            </w:r>
+          </w:p>
+        </w:tc>
+        <w:tc>
+          <w:tcPr>
+            <w:tcW w:type="dxa" w:w="2520"/>
+            <w:vAlign w:val="center"/>
+            <w:tcMar>
+              <w:top w:w="90" w:type="dxa"/>
+              <w:start w:w="110" w:type="dxa"/>
+              <w:bottom w:w="90" w:type="dxa"/>
+              <w:end w:w="110" w:type="dxa"/>
+            </w:tcMar>
+            <w:tcBorders>
+              <w:top w:val="single" w:sz="4" w:color="D9D9D9"/>
+              <w:left w:val="single" w:sz="4" w:color="D9D9D9"/>
+              <w:bottom w:val="single" w:sz="4" w:color="D9D9D9"/>
+              <w:right w:val="single" w:sz="4" w:color="D9D9D9"/>
+            </w:tcBorders>
+            <w:shd w:fill="1F4E78"/>
+          </w:tcPr>
+          <w:p>
+            <w:pPr>
+              <w:spacing w:after="0" w:line="252" w:lineRule="auto"/>
+              <w:jc w:val="center"/>
+            </w:pPr>
+            <w:r/>
+            <w:r>
+              <w:rPr>
+                <w:rFonts w:ascii="Arial" w:hAnsi="Arial"/>
+                <w:b/>
+                <w:color w:val="FFFFFF"/>
+                <w:sz w:val="16"/>
+              </w:rPr>
+              <w:t>Decision</w:t>
+            </w:r>
+          </w:p>
+        </w:tc>
+      </w:tr>
+      <w:tr>
+        <w:tc>
+          <w:tcPr>
+            <w:tcW w:type="dxa" w:w="1999"/>
+            <w:vAlign w:val="center"/>
+            <w:tcMar>
+              <w:top w:w="90" w:type="dxa"/>
+              <w:start w:w="110" w:type="dxa"/>
+              <w:bottom w:w="90" w:type="dxa"/>
+              <w:end w:w="110" w:type="dxa"/>
+            </w:tcMar>
+            <w:tcBorders>
+              <w:top w:val="single" w:sz="4" w:color="D9D9D9"/>
+              <w:left w:val="single" w:sz="4" w:color="D9D9D9"/>
+              <w:bottom w:val="single" w:sz="4" w:color="D9D9D9"/>
+              <w:right w:val="single" w:sz="4" w:color="D9D9D9"/>
+            </w:tcBorders>
+          </w:tcPr>
+          <w:p>
+            <w:pPr>
+              <w:spacing w:after="0" w:line="252" w:lineRule="auto"/>
+              <w:jc w:val="center"/>
+            </w:pPr>
+            <w:r/>
+            <w:r>
+              <w:rPr>
+                <w:rFonts w:ascii="Arial" w:hAnsi="Arial"/>
+                <w:b w:val="0"/>
+                <w:sz w:val="17"/>
+              </w:rPr>
+              <w:t>Simple RNN</w:t>
+            </w:r>
+          </w:p>
+        </w:tc>
+        <w:tc>
+          <w:tcPr>
+            <w:tcW w:type="dxa" w:w="1999"/>
+            <w:vAlign w:val="center"/>
+            <w:tcMar>
+              <w:top w:w="90" w:type="dxa"/>
+              <w:start w:w="110" w:type="dxa"/>
+              <w:bottom w:w="90" w:type="dxa"/>
+              <w:end w:w="110" w:type="dxa"/>
+            </w:tcMar>
+            <w:tcBorders>
+              <w:top w:val="single" w:sz="4" w:color="D9D9D9"/>
+              <w:left w:val="single" w:sz="4" w:color="D9D9D9"/>
+              <w:bottom w:val="single" w:sz="4" w:color="D9D9D9"/>
+              <w:right w:val="single" w:sz="4" w:color="D9D9D9"/>
+            </w:tcBorders>
+          </w:tcPr>
+          <w:p>
+            <w:pPr>
+              <w:spacing w:after="0" w:line="252" w:lineRule="auto"/>
+              <w:jc w:val="center"/>
+            </w:pPr>
+            <w:r/>
+            <w:r>
+              <w:rPr>
+                <w:rFonts w:ascii="Arial" w:hAnsi="Arial"/>
+                <w:b w:val="0"/>
+                <w:sz w:val="17"/>
+              </w:rPr>
+              <w:t>Weak</w:t>
+            </w:r>
+          </w:p>
+        </w:tc>
+        <w:tc>
+          <w:tcPr>
+            <w:tcW w:type="dxa" w:w="1999"/>
+            <w:vAlign w:val="center"/>
+            <w:tcMar>
+              <w:top w:w="90" w:type="dxa"/>
+              <w:start w:w="110" w:type="dxa"/>
+              <w:bottom w:w="90" w:type="dxa"/>
+              <w:end w:w="110" w:type="dxa"/>
+            </w:tcMar>
+            <w:tcBorders>
+              <w:top w:val="single" w:sz="4" w:color="D9D9D9"/>
+              <w:left w:val="single" w:sz="4" w:color="D9D9D9"/>
+              <w:bottom w:val="single" w:sz="4" w:color="D9D9D9"/>
+              <w:right w:val="single" w:sz="4" w:color="D9D9D9"/>
+            </w:tcBorders>
+          </w:tcPr>
+          <w:p>
+            <w:pPr>
+              <w:spacing w:after="0" w:line="252" w:lineRule="auto"/>
+              <w:jc w:val="center"/>
+            </w:pPr>
+            <w:r/>
+            <w:r>
+              <w:rPr>
+                <w:rFonts w:ascii="Arial" w:hAnsi="Arial"/>
+                <w:b w:val="0"/>
+                <w:sz w:val="17"/>
+              </w:rPr>
+              <w:t>Lowest</w:t>
+            </w:r>
+          </w:p>
+        </w:tc>
+        <w:tc>
+          <w:tcPr>
+            <w:tcW w:type="dxa" w:w="1999"/>
+            <w:vAlign w:val="center"/>
+            <w:tcMar>
+              <w:top w:w="90" w:type="dxa"/>
+              <w:start w:w="110" w:type="dxa"/>
+              <w:bottom w:w="90" w:type="dxa"/>
+              <w:end w:w="110" w:type="dxa"/>
+            </w:tcMar>
+            <w:tcBorders>
+              <w:top w:val="single" w:sz="4" w:color="D9D9D9"/>
+              <w:left w:val="single" w:sz="4" w:color="D9D9D9"/>
+              <w:bottom w:val="single" w:sz="4" w:color="D9D9D9"/>
+              <w:right w:val="single" w:sz="4" w:color="D9D9D9"/>
+            </w:tcBorders>
+          </w:tcPr>
+          <w:p>
+            <w:pPr>
+              <w:spacing w:after="0" w:line="252" w:lineRule="auto"/>
+              <w:jc w:val="center"/>
+            </w:pPr>
+            <w:r/>
+            <w:r>
+              <w:rPr>
+                <w:rFonts w:ascii="Arial" w:hAnsi="Arial"/>
+                <w:b w:val="0"/>
+                <w:sz w:val="17"/>
+              </w:rPr>
+              <w:t>Moderate at low T</w:t>
+            </w:r>
+          </w:p>
+        </w:tc>
+        <w:tc>
+          <w:tcPr>
+            <w:tcW w:type="dxa" w:w="1999"/>
+            <w:vAlign w:val="center"/>
+            <w:tcMar>
+              <w:top w:w="90" w:type="dxa"/>
+              <w:start w:w="110" w:type="dxa"/>
+              <w:bottom w:w="90" w:type="dxa"/>
+              <w:end w:w="110" w:type="dxa"/>
+            </w:tcMar>
+            <w:tcBorders>
+              <w:top w:val="single" w:sz="4" w:color="D9D9D9"/>
+              <w:left w:val="single" w:sz="4" w:color="D9D9D9"/>
+              <w:bottom w:val="single" w:sz="4" w:color="D9D9D9"/>
+              <w:right w:val="single" w:sz="4" w:color="D9D9D9"/>
+            </w:tcBorders>
+          </w:tcPr>
+          <w:p>
+            <w:pPr>
+              <w:spacing w:after="0" w:line="252" w:lineRule="auto"/>
+              <w:jc w:val="left"/>
+            </w:pPr>
+            <w:r/>
+            <w:r>
+              <w:rPr>
+                <w:rFonts w:ascii="Arial" w:hAnsi="Arial"/>
+                <w:b w:val="0"/>
+                <w:sz w:val="17"/>
+              </w:rPr>
+              <w:t>Useful baseline</w:t>
+            </w:r>
+          </w:p>
+        </w:tc>
+      </w:tr>
+      <w:tr>
+        <w:tc>
+          <w:tcPr>
+            <w:tcW w:type="dxa" w:w="1999"/>
+            <w:shd w:fill="F5F7F9"/>
+            <w:vAlign w:val="center"/>
+            <w:tcMar>
+              <w:top w:w="90" w:type="dxa"/>
+              <w:start w:w="110" w:type="dxa"/>
+              <w:bottom w:w="90" w:type="dxa"/>
+              <w:end w:w="110" w:type="dxa"/>
+            </w:tcMar>
+            <w:tcBorders>
+              <w:top w:val="single" w:sz="4" w:color="D9D9D9"/>
+              <w:left w:val="single" w:sz="4" w:color="D9D9D9"/>
+              <w:bottom w:val="single" w:sz="4" w:color="D9D9D9"/>
+              <w:right w:val="single" w:sz="4" w:color="D9D9D9"/>
+            </w:tcBorders>
+          </w:tcPr>
+          <w:p>
+            <w:pPr>
+              <w:spacing w:after="0" w:line="252" w:lineRule="auto"/>
+              <w:jc w:val="center"/>
+            </w:pPr>
+            <w:r/>
+            <w:r>
+              <w:rPr>
+                <w:rFonts w:ascii="Arial" w:hAnsi="Arial"/>
+                <w:b w:val="0"/>
+                <w:sz w:val="17"/>
+              </w:rPr>
+              <w:t>BiRNN</w:t>
+            </w:r>
+          </w:p>
+        </w:tc>
+        <w:tc>
+          <w:tcPr>
+            <w:tcW w:type="dxa" w:w="1999"/>
+            <w:shd w:fill="F5F7F9"/>
+            <w:vAlign w:val="center"/>
+            <w:tcMar>
+              <w:top w:w="90" w:type="dxa"/>
+              <w:start w:w="110" w:type="dxa"/>
+              <w:bottom w:w="90" w:type="dxa"/>
+              <w:end w:w="110" w:type="dxa"/>
+            </w:tcMar>
+            <w:tcBorders>
+              <w:top w:val="single" w:sz="4" w:color="D9D9D9"/>
+              <w:left w:val="single" w:sz="4" w:color="D9D9D9"/>
+              <w:bottom w:val="single" w:sz="4" w:color="D9D9D9"/>
+              <w:right w:val="single" w:sz="4" w:color="D9D9D9"/>
+            </w:tcBorders>
+          </w:tcPr>
+          <w:p>
+            <w:pPr>
+              <w:spacing w:after="0" w:line="252" w:lineRule="auto"/>
+              <w:jc w:val="center"/>
+            </w:pPr>
+            <w:r/>
+            <w:r>
+              <w:rPr>
+                <w:rFonts w:ascii="Arial" w:hAnsi="Arial"/>
+                <w:b w:val="0"/>
+                <w:sz w:val="17"/>
+              </w:rPr>
+              <w:t>Weak</w:t>
+            </w:r>
+          </w:p>
+        </w:tc>
+        <w:tc>
+          <w:tcPr>
+            <w:tcW w:type="dxa" w:w="1999"/>
+            <w:shd w:fill="F5F7F9"/>
+            <w:vAlign w:val="center"/>
+            <w:tcMar>
+              <w:top w:w="90" w:type="dxa"/>
+              <w:start w:w="110" w:type="dxa"/>
+              <w:bottom w:w="90" w:type="dxa"/>
+              <w:end w:w="110" w:type="dxa"/>
+            </w:tcMar>
+            <w:tcBorders>
+              <w:top w:val="single" w:sz="4" w:color="D9D9D9"/>
+              <w:left w:val="single" w:sz="4" w:color="D9D9D9"/>
+              <w:bottom w:val="single" w:sz="4" w:color="D9D9D9"/>
+              <w:right w:val="single" w:sz="4" w:color="D9D9D9"/>
+            </w:tcBorders>
+          </w:tcPr>
+          <w:p>
+            <w:pPr>
+              <w:spacing w:after="0" w:line="252" w:lineRule="auto"/>
+              <w:jc w:val="center"/>
+            </w:pPr>
+            <w:r/>
+            <w:r>
+              <w:rPr>
+                <w:rFonts w:ascii="Arial" w:hAnsi="Arial"/>
+                <w:b w:val="0"/>
+                <w:sz w:val="17"/>
+              </w:rPr>
+              <w:t>Highest</w:t>
+            </w:r>
+          </w:p>
+        </w:tc>
+        <w:tc>
+          <w:tcPr>
+            <w:tcW w:type="dxa" w:w="1999"/>
+            <w:shd w:fill="F5F7F9"/>
+            <w:vAlign w:val="center"/>
+            <w:tcMar>
+              <w:top w:w="90" w:type="dxa"/>
+              <w:start w:w="110" w:type="dxa"/>
+              <w:bottom w:w="90" w:type="dxa"/>
+              <w:end w:w="110" w:type="dxa"/>
+            </w:tcMar>
+            <w:tcBorders>
+              <w:top w:val="single" w:sz="4" w:color="D9D9D9"/>
+              <w:left w:val="single" w:sz="4" w:color="D9D9D9"/>
+              <w:bottom w:val="single" w:sz="4" w:color="D9D9D9"/>
+              <w:right w:val="single" w:sz="4" w:color="D9D9D9"/>
+            </w:tcBorders>
+          </w:tcPr>
+          <w:p>
+            <w:pPr>
+              <w:spacing w:after="0" w:line="252" w:lineRule="auto"/>
+              <w:jc w:val="center"/>
+            </w:pPr>
+            <w:r/>
+            <w:r>
+              <w:rPr>
+                <w:rFonts w:ascii="Arial" w:hAnsi="Arial"/>
+                <w:b w:val="0"/>
+                <w:sz w:val="17"/>
+              </w:rPr>
+              <w:t>Moderate at low T</w:t>
+            </w:r>
+          </w:p>
+        </w:tc>
+        <w:tc>
+          <w:tcPr>
+            <w:tcW w:type="dxa" w:w="1999"/>
+            <w:shd w:fill="F5F7F9"/>
+            <w:vAlign w:val="center"/>
+            <w:tcMar>
+              <w:top w:w="90" w:type="dxa"/>
+              <w:start w:w="110" w:type="dxa"/>
+              <w:bottom w:w="90" w:type="dxa"/>
+              <w:end w:w="110" w:type="dxa"/>
+            </w:tcMar>
+            <w:tcBorders>
+              <w:top w:val="single" w:sz="4" w:color="D9D9D9"/>
+              <w:left w:val="single" w:sz="4" w:color="D9D9D9"/>
+              <w:bottom w:val="single" w:sz="4" w:color="D9D9D9"/>
+              <w:right w:val="single" w:sz="4" w:color="D9D9D9"/>
+            </w:tcBorders>
+          </w:tcPr>
+          <w:p>
+            <w:pPr>
+              <w:spacing w:after="0" w:line="252" w:lineRule="auto"/>
+              <w:jc w:val="left"/>
+            </w:pPr>
+            <w:r/>
+            <w:r>
+              <w:rPr>
+                <w:rFonts w:ascii="Arial" w:hAnsi="Arial"/>
+                <w:b w:val="0"/>
+                <w:sz w:val="17"/>
+              </w:rPr>
+              <w:t>Not selected</w:t>
+            </w:r>
+          </w:p>
+        </w:tc>
+      </w:tr>
+      <w:tr>
+        <w:tc>
+          <w:tcPr>
+            <w:tcW w:type="dxa" w:w="1999"/>
+            <w:vAlign w:val="center"/>
+            <w:tcMar>
+              <w:top w:w="90" w:type="dxa"/>
+              <w:start w:w="110" w:type="dxa"/>
+              <w:bottom w:w="90" w:type="dxa"/>
+              <w:end w:w="110" w:type="dxa"/>
+            </w:tcMar>
+            <w:tcBorders>
+              <w:top w:val="single" w:sz="4" w:color="D9D9D9"/>
+              <w:left w:val="single" w:sz="4" w:color="D9D9D9"/>
+              <w:bottom w:val="single" w:sz="4" w:color="D9D9D9"/>
+              <w:right w:val="single" w:sz="4" w:color="D9D9D9"/>
+            </w:tcBorders>
+          </w:tcPr>
+          <w:p>
+            <w:pPr>
+              <w:spacing w:after="0" w:line="252" w:lineRule="auto"/>
+              <w:jc w:val="center"/>
+            </w:pPr>
+            <w:r/>
+            <w:r>
+              <w:rPr>
+                <w:rFonts w:ascii="Arial" w:hAnsi="Arial"/>
+                <w:b w:val="0"/>
+                <w:sz w:val="17"/>
+              </w:rPr>
+              <w:t>LSTM</w:t>
+            </w:r>
+          </w:p>
+        </w:tc>
+        <w:tc>
+          <w:tcPr>
+            <w:tcW w:type="dxa" w:w="1999"/>
+            <w:vAlign w:val="center"/>
+            <w:tcMar>
+              <w:top w:w="90" w:type="dxa"/>
+              <w:start w:w="110" w:type="dxa"/>
+              <w:bottom w:w="90" w:type="dxa"/>
+              <w:end w:w="110" w:type="dxa"/>
+            </w:tcMar>
+            <w:tcBorders>
+              <w:top w:val="single" w:sz="4" w:color="D9D9D9"/>
+              <w:left w:val="single" w:sz="4" w:color="D9D9D9"/>
+              <w:bottom w:val="single" w:sz="4" w:color="D9D9D9"/>
+              <w:right w:val="single" w:sz="4" w:color="D9D9D9"/>
+            </w:tcBorders>
+          </w:tcPr>
+          <w:p>
+            <w:pPr>
+              <w:spacing w:after="0" w:line="252" w:lineRule="auto"/>
+              <w:jc w:val="center"/>
+            </w:pPr>
+            <w:r/>
+            <w:r>
+              <w:rPr>
+                <w:rFonts w:ascii="Arial" w:hAnsi="Arial"/>
+                <w:b w:val="0"/>
+                <w:sz w:val="17"/>
+              </w:rPr>
+              <w:t>Strong</w:t>
+            </w:r>
+          </w:p>
+        </w:tc>
+        <w:tc>
+          <w:tcPr>
+            <w:tcW w:type="dxa" w:w="1999"/>
+            <w:vAlign w:val="center"/>
+            <w:tcMar>
+              <w:top w:w="90" w:type="dxa"/>
+              <w:start w:w="110" w:type="dxa"/>
+              <w:bottom w:w="90" w:type="dxa"/>
+              <w:end w:w="110" w:type="dxa"/>
+            </w:tcMar>
+            <w:tcBorders>
+              <w:top w:val="single" w:sz="4" w:color="D9D9D9"/>
+              <w:left w:val="single" w:sz="4" w:color="D9D9D9"/>
+              <w:bottom w:val="single" w:sz="4" w:color="D9D9D9"/>
+              <w:right w:val="single" w:sz="4" w:color="D9D9D9"/>
+            </w:tcBorders>
+          </w:tcPr>
+          <w:p>
+            <w:pPr>
+              <w:spacing w:after="0" w:line="252" w:lineRule="auto"/>
+              <w:jc w:val="center"/>
+            </w:pPr>
+            <w:r/>
+            <w:r>
+              <w:rPr>
+                <w:rFonts w:ascii="Arial" w:hAnsi="Arial"/>
+                <w:b w:val="0"/>
+                <w:sz w:val="17"/>
+              </w:rPr>
+              <w:t>Moderate</w:t>
+            </w:r>
+          </w:p>
+        </w:tc>
+        <w:tc>
+          <w:tcPr>
+            <w:tcW w:type="dxa" w:w="1999"/>
+            <w:vAlign w:val="center"/>
+            <w:tcMar>
+              <w:top w:w="90" w:type="dxa"/>
+              <w:start w:w="110" w:type="dxa"/>
+              <w:bottom w:w="90" w:type="dxa"/>
+              <w:end w:w="110" w:type="dxa"/>
+            </w:tcMar>
+            <w:tcBorders>
+              <w:top w:val="single" w:sz="4" w:color="D9D9D9"/>
+              <w:left w:val="single" w:sz="4" w:color="D9D9D9"/>
+              <w:bottom w:val="single" w:sz="4" w:color="D9D9D9"/>
+              <w:right w:val="single" w:sz="4" w:color="D9D9D9"/>
+            </w:tcBorders>
+          </w:tcPr>
+          <w:p>
+            <w:pPr>
+              <w:spacing w:after="0" w:line="252" w:lineRule="auto"/>
+              <w:jc w:val="center"/>
+            </w:pPr>
+            <w:r/>
+            <w:r>
+              <w:rPr>
+                <w:rFonts w:ascii="Arial" w:hAnsi="Arial"/>
+                <w:b w:val="0"/>
+                <w:sz w:val="17"/>
+              </w:rPr>
+              <w:t>Strong at T 0.3</w:t>
+            </w:r>
+          </w:p>
+        </w:tc>
+        <w:tc>
+          <w:tcPr>
+            <w:tcW w:type="dxa" w:w="1999"/>
+            <w:vAlign w:val="center"/>
+            <w:tcMar>
+              <w:top w:w="90" w:type="dxa"/>
+              <w:start w:w="110" w:type="dxa"/>
+              <w:bottom w:w="90" w:type="dxa"/>
+              <w:end w:w="110" w:type="dxa"/>
+            </w:tcMar>
+            <w:tcBorders>
+              <w:top w:val="single" w:sz="4" w:color="D9D9D9"/>
+              <w:left w:val="single" w:sz="4" w:color="D9D9D9"/>
+              <w:bottom w:val="single" w:sz="4" w:color="D9D9D9"/>
+              <w:right w:val="single" w:sz="4" w:color="D9D9D9"/>
+            </w:tcBorders>
+          </w:tcPr>
+          <w:p>
+            <w:pPr>
+              <w:spacing w:after="0" w:line="252" w:lineRule="auto"/>
+              <w:jc w:val="left"/>
+            </w:pPr>
+            <w:r/>
+            <w:r>
+              <w:rPr>
+                <w:rFonts w:ascii="Arial" w:hAnsi="Arial"/>
+                <w:b w:val="0"/>
+                <w:sz w:val="17"/>
+              </w:rPr>
+              <w:t>Best cost-quality alternative</w:t>
+            </w:r>
+          </w:p>
+        </w:tc>
+      </w:tr>
+      <w:tr>
+        <w:tc>
+          <w:tcPr>
+            <w:tcW w:type="dxa" w:w="1999"/>
+            <w:shd w:fill="F5F7F9"/>
+            <w:vAlign w:val="center"/>
+            <w:tcMar>
+              <w:top w:w="90" w:type="dxa"/>
+              <w:start w:w="110" w:type="dxa"/>
+              <w:bottom w:w="90" w:type="dxa"/>
+              <w:end w:w="110" w:type="dxa"/>
+            </w:tcMar>
+            <w:tcBorders>
+              <w:top w:val="single" w:sz="4" w:color="D9D9D9"/>
+              <w:left w:val="single" w:sz="4" w:color="D9D9D9"/>
+              <w:bottom w:val="single" w:sz="4" w:color="D9D9D9"/>
+              <w:right w:val="single" w:sz="4" w:color="D9D9D9"/>
+            </w:tcBorders>
+          </w:tcPr>
+          <w:p>
+            <w:pPr>
+              <w:spacing w:after="0" w:line="252" w:lineRule="auto"/>
+              <w:jc w:val="center"/>
+            </w:pPr>
+            <w:r/>
+            <w:r>
+              <w:rPr>
+                <w:rFonts w:ascii="Arial" w:hAnsi="Arial"/>
+                <w:b w:val="0"/>
+                <w:sz w:val="17"/>
+              </w:rPr>
+              <w:t>GRU</w:t>
+            </w:r>
+          </w:p>
+        </w:tc>
+        <w:tc>
+          <w:tcPr>
+            <w:tcW w:type="dxa" w:w="1999"/>
+            <w:shd w:fill="F5F7F9"/>
+            <w:vAlign w:val="center"/>
+            <w:tcMar>
+              <w:top w:w="90" w:type="dxa"/>
+              <w:start w:w="110" w:type="dxa"/>
+              <w:bottom w:w="90" w:type="dxa"/>
+              <w:end w:w="110" w:type="dxa"/>
+            </w:tcMar>
+            <w:tcBorders>
+              <w:top w:val="single" w:sz="4" w:color="D9D9D9"/>
+              <w:left w:val="single" w:sz="4" w:color="D9D9D9"/>
+              <w:bottom w:val="single" w:sz="4" w:color="D9D9D9"/>
+              <w:right w:val="single" w:sz="4" w:color="D9D9D9"/>
+            </w:tcBorders>
+          </w:tcPr>
+          <w:p>
+            <w:pPr>
+              <w:spacing w:after="0" w:line="252" w:lineRule="auto"/>
+              <w:jc w:val="center"/>
+            </w:pPr>
+            <w:r/>
+            <w:r>
+              <w:rPr>
+                <w:rFonts w:ascii="Arial" w:hAnsi="Arial"/>
+                <w:b w:val="0"/>
+                <w:sz w:val="17"/>
+              </w:rPr>
+              <w:t>Best</w:t>
+            </w:r>
+          </w:p>
+        </w:tc>
+        <w:tc>
+          <w:tcPr>
+            <w:tcW w:type="dxa" w:w="1999"/>
+            <w:shd w:fill="F5F7F9"/>
+            <w:vAlign w:val="center"/>
+            <w:tcMar>
+              <w:top w:w="90" w:type="dxa"/>
+              <w:start w:w="110" w:type="dxa"/>
+              <w:bottom w:w="90" w:type="dxa"/>
+              <w:end w:w="110" w:type="dxa"/>
+            </w:tcMar>
+            <w:tcBorders>
+              <w:top w:val="single" w:sz="4" w:color="D9D9D9"/>
+              <w:left w:val="single" w:sz="4" w:color="D9D9D9"/>
+              <w:bottom w:val="single" w:sz="4" w:color="D9D9D9"/>
+              <w:right w:val="single" w:sz="4" w:color="D9D9D9"/>
+            </w:tcBorders>
+          </w:tcPr>
+          <w:p>
+            <w:pPr>
+              <w:spacing w:after="0" w:line="252" w:lineRule="auto"/>
+              <w:jc w:val="center"/>
+            </w:pPr>
+            <w:r/>
+            <w:r>
+              <w:rPr>
+                <w:rFonts w:ascii="Arial" w:hAnsi="Arial"/>
+                <w:b w:val="0"/>
+                <w:sz w:val="17"/>
+              </w:rPr>
+              <w:t>High</w:t>
+            </w:r>
+          </w:p>
+        </w:tc>
+        <w:tc>
+          <w:tcPr>
+            <w:tcW w:type="dxa" w:w="1999"/>
+            <w:shd w:fill="F5F7F9"/>
+            <w:vAlign w:val="center"/>
+            <w:tcMar>
+              <w:top w:w="90" w:type="dxa"/>
+              <w:start w:w="110" w:type="dxa"/>
+              <w:bottom w:w="90" w:type="dxa"/>
+              <w:end w:w="110" w:type="dxa"/>
+            </w:tcMar>
+            <w:tcBorders>
+              <w:top w:val="single" w:sz="4" w:color="D9D9D9"/>
+              <w:left w:val="single" w:sz="4" w:color="D9D9D9"/>
+              <w:bottom w:val="single" w:sz="4" w:color="D9D9D9"/>
+              <w:right w:val="single" w:sz="4" w:color="D9D9D9"/>
+            </w:tcBorders>
+          </w:tcPr>
+          <w:p>
+            <w:pPr>
+              <w:spacing w:after="0" w:line="252" w:lineRule="auto"/>
+              <w:jc w:val="center"/>
+            </w:pPr>
+            <w:r/>
+            <w:r>
+              <w:rPr>
+                <w:rFonts w:ascii="Arial" w:hAnsi="Arial"/>
+                <w:b w:val="0"/>
+                <w:sz w:val="17"/>
+              </w:rPr>
+              <w:t>Best at T 0.3</w:t>
+            </w:r>
+          </w:p>
+        </w:tc>
+        <w:tc>
+          <w:tcPr>
+            <w:tcW w:type="dxa" w:w="1999"/>
+            <w:shd w:fill="F5F7F9"/>
+            <w:vAlign w:val="center"/>
+            <w:tcMar>
+              <w:top w:w="90" w:type="dxa"/>
+              <w:start w:w="110" w:type="dxa"/>
+              <w:bottom w:w="90" w:type="dxa"/>
+              <w:end w:w="110" w:type="dxa"/>
+            </w:tcMar>
+            <w:tcBorders>
+              <w:top w:val="single" w:sz="4" w:color="D9D9D9"/>
+              <w:left w:val="single" w:sz="4" w:color="D9D9D9"/>
+              <w:bottom w:val="single" w:sz="4" w:color="D9D9D9"/>
+              <w:right w:val="single" w:sz="4" w:color="D9D9D9"/>
+            </w:tcBorders>
+          </w:tcPr>
+          <w:p>
+            <w:pPr>
+              <w:spacing w:after="0" w:line="252" w:lineRule="auto"/>
+              <w:jc w:val="left"/>
+            </w:pPr>
+            <w:r/>
+            <w:r>
+              <w:rPr>
+                <w:rFonts w:ascii="Arial" w:hAnsi="Arial"/>
+                <w:b w:val="0"/>
+                <w:sz w:val="17"/>
+              </w:rPr>
+              <w:t>Selected final model</w:t>
+            </w:r>
+          </w:p>
+        </w:tc>
+      </w:tr>
+    </w:tbl>
     <w:p>
       <w:pPr>
-        <w:spacing w:after="140" w:line="269" w:lineRule="auto"/>
+        <w:spacing w:after="120" w:line="269" w:lineRule="auto"/>
       </w:pPr>
       <w:r>
         <w:rPr>
           <w:rFonts w:ascii="Arial" w:hAnsi="Arial"/>
           <w:sz w:val="21"/>
         </w:rPr>
-        <w:t>The study used one random seed, early stopping yielded different epoch counts across models, and GRU was still improving at the epoch cap. The rhyme metric only applies when line-ending words are covered by the CMU Pronouncing Dictionary. Manual scores used one rater and five poems per cell, so overlapping intervals should not be treated as precise rank differences. Perplexity measures next-token prediction and does not fully capture poetic coherence or humour.</w:t>
+        <w:t>The final system uses GRU with temperature 0.3. This choice is supported by the best held-out perplexity and accuracy, perfect five-line completion in the sweep, the strongest automatic rhyme score, and the highest contextual-consistency rating. LSTM at temperature 0.3 remains a credible alternative when shorter training time is more important than the last increment in predictive quality.</w:t>
       </w:r>
     </w:p>
     <w:p>
       <w:pPr>
         <w:pStyle w:val="Heading1"/>
+        <w:keepNext/>
+      </w:pPr>
+      <w:r>
+        <w:t>11 Limitations</w:t>
+      </w:r>
+    </w:p>
+    <w:p>
+      <w:pPr>
+        <w:spacing w:after="120" w:line="269" w:lineRule="auto"/>
+      </w:pPr>
+      <w:r>
+        <w:rPr>
+          <w:rFonts w:ascii="Arial" w:hAnsi="Arial"/>
+          <w:sz w:val="21"/>
+        </w:rPr>
+        <w:t>The study used one random seed, so training variance is unknown. Early stopping produced different epoch counts, which is expected for validation-based model selection but prevents a strict equal-update comparison. GRU was still improving at the epoch cap and might benefit from a longer capped run. The rhyme metric depends on coverage in the CMU Pronouncing Dictionary. Manual evaluation used one rater and five poems per cell; overlapping intervals should not be interpreted as precise rankings. Perplexity measures next-token prediction and does not directly measure humour, narrative coherence, or originality.</w:t>
+      </w:r>
+    </w:p>
+    <w:p>
+      <w:r>
+        <w:br w:type="page"/>
+      </w:r>
+    </w:p>
+    <w:p>
+      <w:pPr>
+        <w:pStyle w:val="Heading1"/>
+        <w:keepNext/>
+      </w:pPr>
+      <w:r>
+        <w:t>12 Reproducibility</w:t>
+      </w:r>
+    </w:p>
+    <w:p>
+      <w:pPr>
+        <w:spacing w:after="120" w:line="269" w:lineRule="auto"/>
+      </w:pPr>
+      <w:r>
+        <w:rPr>
+          <w:rFonts w:ascii="Arial" w:hAnsi="Arial"/>
+          <w:sz w:val="21"/>
+        </w:rPr>
+        <w:t>The repository contains preprocessing and training code, final model checkpoints, run metadata, learning curves, test metrics, the 7,200-sample generation sweep, automatic metric outputs, the blinded scoring workbook, and the unblinded manual-score summary. The final configuration uses seed 42 and records the data split, vocabulary size, context length, optimiser settings, epoch history, and checkpoint selection for each model.</w:t>
+      </w:r>
+    </w:p>
+    <w:p>
+      <w:pPr>
+        <w:pStyle w:val="Heading1"/>
+        <w:keepNext/>
+      </w:pPr>
+      <w:r>
+        <w:t>13 Conclusion</w:t>
+      </w:r>
+    </w:p>
+    <w:p>
+      <w:pPr>
+        <w:spacing w:after="120" w:line="269" w:lineRule="auto"/>
+      </w:pPr>
+      <w:r>
+        <w:rPr>
+          <w:rFonts w:ascii="Arial" w:hAnsi="Arial"/>
+          <w:sz w:val="21"/>
+        </w:rPr>
+        <w:t>Gating was the main architectural advantage in this experiment. LSTM and GRU both improved substantially on Simple RNN and BiRNN, while bidirectionality alone added compute without improving held-out perplexity. GRU at temperature 0.3 provides the strongest overall submission result. It should be reported with the manual-sample and rhyme-metric limitations above, and without claiming human-level poetic quality.</w:t>
+      </w:r>
+    </w:p>
+    <w:p>
+      <w:pPr>
+        <w:pStyle w:val="Heading1"/>
+        <w:keepNext/>
       </w:pPr>
       <w:r>
         <w:t>References</w:t>
@@ -1522,7 +3976,7 @@
     </w:p>
     <w:p>
       <w:pPr>
-        <w:spacing w:after="140" w:line="269" w:lineRule="auto"/>
+        <w:spacing w:after="40" w:line="269" w:lineRule="auto"/>
       </w:pPr>
       <w:r>
         <w:rPr>
@@ -1532,10 +3986,34 @@
         <w:t>Limerick Dataset OEDILF v3. Zenodo. https://doi.org/10.5281/zenodo.5722527</w:t>
       </w:r>
     </w:p>
+    <w:p>
+      <w:pPr>
+        <w:spacing w:after="40" w:line="269" w:lineRule="auto"/>
+      </w:pPr>
+      <w:r>
+        <w:rPr>
+          <w:rFonts w:ascii="Arial" w:hAnsi="Arial"/>
+          <w:sz w:val="21"/>
+        </w:rPr>
+        <w:t>CMU Pronouncing Dictionary. Carnegie Mellon University. http://www.speech.cs.cmu.edu/cgi-bin/cmudict</w:t>
+      </w:r>
+    </w:p>
+    <w:p>
+      <w:pPr>
+        <w:spacing w:after="40" w:line="269" w:lineRule="auto"/>
+      </w:pPr>
+      <w:r>
+        <w:rPr>
+          <w:rFonts w:ascii="Arial" w:hAnsi="Arial"/>
+          <w:sz w:val="21"/>
+        </w:rPr>
+        <w:t>PyTorch. https://pytorch.org</w:t>
+      </w:r>
+    </w:p>
     <w:sectPr>
-      <w:footerReference w:type="default" r:id="rId9"/>
+      <w:footerReference w:type="default" r:id="rId13"/>
       <w:pgSz w:w="12240" w:h="15840"/>
-      <w:pgMar w:top="1080" w:right="1152" w:bottom="1080" w:left="1152" w:header="720" w:footer="720" w:gutter="0"/>
+      <w:pgMar w:top="1037" w:right="1123" w:bottom="965" w:left="1123" w:header="720" w:footer="720" w:gutter="0"/>
       <w:cols w:space="720"/>
       <w:docGrid w:linePitch="360"/>
     </w:sectPr>
@@ -1551,7 +4029,18 @@
       <w:jc w:val="center"/>
     </w:pPr>
     <w:r>
-      <w:t>ICT4403 Assignment 2 | Word Level Autoregressive Limerick Generation</w:t>
+      <w:rPr>
+        <w:rFonts w:ascii="Arial" w:hAnsi="Arial"/>
+        <w:sz w:val="16"/>
+      </w:rPr>
+      <w:t xml:space="preserve">ICT4403 Assignment 2   |   Page </w:t>
+    </w:r>
+    <w:r>
+      <w:fldChar w:fldCharType="begin"/>
+      <w:instrText xml:space="preserve"> PAGE </w:instrText>
+      <w:fldChar w:fldCharType="separate"/>
+      <w:t>1</w:t>
+      <w:fldChar w:fldCharType="end"/>
     </w:r>
   </w:p>
 </w:ftr>
@@ -1980,7 +4469,7 @@
     <w:pPr>
       <w:keepNext/>
       <w:keepLines/>
-      <w:spacing w:before="480" w:after="0"/>
+      <w:spacing w:before="220" w:after="100"/>
       <w:outlineLvl w:val="0"/>
     </w:pPr>
     <w:rPr>
@@ -2012,7 +4501,7 @@
       <w:b/>
       <w:bCs/>
       <w:color w:val="000000"/>
-      <w:sz w:val="22"/>
+      <w:sz w:val="23"/>
       <w:szCs w:val="26"/>
     </w:rPr>
   </w:style>
@@ -2266,9 +4755,6 @@
     <w:qFormat/>
     <w:rsid w:val="00FC693F"/>
     <w:pPr>
-      <w:pBdr>
-        <w:bottom w:val="single" w:sz="8" w:space="4" w:color="4F81BD" w:themeColor="accent1"/>
-      </w:pBdr>
       <w:spacing w:after="300" w:line="240" w:lineRule="auto"/>
       <w:contextualSpacing/>
     </w:pPr>
@@ -2310,12 +4796,12 @@
       </w:numPr>
     </w:pPr>
     <w:rPr>
-      <w:rFonts w:asciiTheme="majorHAnsi" w:eastAsiaTheme="majorEastAsia" w:hAnsiTheme="majorHAnsi" w:cstheme="majorBidi"/>
+      <w:rFonts w:asciiTheme="majorHAnsi" w:eastAsiaTheme="majorEastAsia" w:hAnsiTheme="majorHAnsi" w:cstheme="majorBidi" w:ascii="Arial" w:hAnsi="Arial"/>
       <w:i/>
       <w:iCs/>
-      <w:color w:val="4F81BD" w:themeColor="accent1"/>
+      <w:color w:val="000000"/>
       <w:spacing w:val="15"/>
-      <w:sz w:val="24"/>
+      <w:sz w:val="22"/>
       <w:szCs w:val="24"/>
     </w:rPr>
   </w:style>

</xml_diff>